<commit_message>
cv updated july 2026
</commit_message>
<xml_diff>
--- a/assets/pdf/RuthvikBommena_FullCV_May2026.docx
+++ b/assets/pdf/RuthvikBommena_FullCV_May2026.docx
@@ -756,7 +756,7 @@
           <w:sz w:val="22"/>
           <w:szCs w:val="22"/>
         </w:rPr>
-        <w:t>Line-of-Sight and Field-of-View Constrained Beacon Placement Optimization for Robust Relative Navigation</w:t>
+        <w:t>Adaptive Homotopy Continuation Using Reinforcement Learning for Enhanced Convergence and Computational Efficiency</w:t>
       </w:r>
       <w:r>
         <w:rPr>
@@ -774,7 +774,7 @@
           <w:sz w:val="22"/>
           <w:szCs w:val="22"/>
         </w:rPr>
-        <w:t>Acta Astronautica</w:t>
+        <w:t>Aerospace Science and Technology</w:t>
       </w:r>
       <w:r>
         <w:rPr>
@@ -800,23 +800,7 @@
           <w:sz w:val="22"/>
           <w:szCs w:val="22"/>
         </w:rPr>
-        <w:t>6 [</w:t>
-      </w:r>
-      <w:r>
-        <w:rPr>
-          <w:rFonts w:eastAsia="Garamond"/>
-          <w:sz w:val="22"/>
-          <w:szCs w:val="22"/>
-        </w:rPr>
-        <w:t>UNDER REVIEW</w:t>
-      </w:r>
-      <w:r>
-        <w:rPr>
-          <w:rFonts w:eastAsia="Garamond"/>
-          <w:sz w:val="22"/>
-          <w:szCs w:val="22"/>
-        </w:rPr>
-        <w:t>]</w:t>
+        <w:t>6 [UNDER REVIEW]</w:t>
       </w:r>
       <w:r>
         <w:rPr>
@@ -826,6 +810,25 @@
         </w:rPr>
         <w:t>.</w:t>
       </w:r>
+      <w:r>
+        <w:rPr>
+          <w:rFonts w:eastAsia="Garamond"/>
+          <w:sz w:val="22"/>
+          <w:szCs w:val="22"/>
+        </w:rPr>
+        <w:t xml:space="preserve"> </w:t>
+      </w:r>
+      <w:hyperlink r:id="rId13" w:tgtFrame="_blank" w:history="1">
+        <w:r>
+          <w:rPr>
+            <w:rStyle w:val="Hyperlink"/>
+            <w:rFonts w:eastAsia="Garamond"/>
+            <w:sz w:val="22"/>
+            <w:szCs w:val="22"/>
+          </w:rPr>
+          <w:t>10.2139/ssrn.7070744</w:t>
+        </w:r>
+      </w:hyperlink>
     </w:p>
     <w:p>
       <w:pPr>
@@ -856,6 +859,117 @@
           <w:sz w:val="22"/>
           <w:szCs w:val="22"/>
         </w:rPr>
+        <w:t xml:space="preserve"> and R. Woollands, "</w:t>
+      </w:r>
+      <w:r>
+        <w:rPr>
+          <w:rFonts w:eastAsia="Garamond"/>
+          <w:sz w:val="22"/>
+          <w:szCs w:val="22"/>
+        </w:rPr>
+        <w:t>Fault-Tolerant Beacon Placement Optimization with Line-of-Sight and Field-of-View Constraints for Robust Relative Navigation</w:t>
+      </w:r>
+      <w:r>
+        <w:rPr>
+          <w:rFonts w:eastAsia="Garamond"/>
+          <w:sz w:val="22"/>
+          <w:szCs w:val="22"/>
+        </w:rPr>
+        <w:t xml:space="preserve">," </w:t>
+      </w:r>
+      <w:r>
+        <w:rPr>
+          <w:rFonts w:eastAsia="Garamond"/>
+          <w:i/>
+          <w:iCs/>
+          <w:sz w:val="22"/>
+          <w:szCs w:val="22"/>
+        </w:rPr>
+        <w:t>Acta Astronautica</w:t>
+      </w:r>
+      <w:r>
+        <w:rPr>
+          <w:rFonts w:eastAsia="Garamond"/>
+          <w:i/>
+          <w:iCs/>
+          <w:sz w:val="22"/>
+          <w:szCs w:val="22"/>
+        </w:rPr>
+        <w:t xml:space="preserve">, </w:t>
+      </w:r>
+      <w:r>
+        <w:rPr>
+          <w:rFonts w:eastAsia="Garamond"/>
+          <w:sz w:val="22"/>
+          <w:szCs w:val="22"/>
+        </w:rPr>
+        <w:t>202</w:t>
+      </w:r>
+      <w:r>
+        <w:rPr>
+          <w:rFonts w:eastAsia="Garamond"/>
+          <w:sz w:val="22"/>
+          <w:szCs w:val="22"/>
+        </w:rPr>
+        <w:t>6</w:t>
+      </w:r>
+      <w:r>
+        <w:rPr>
+          <w:rFonts w:eastAsia="Garamond"/>
+          <w:sz w:val="22"/>
+          <w:szCs w:val="22"/>
+        </w:rPr>
+        <w:t>.</w:t>
+      </w:r>
+      <w:r>
+        <w:rPr>
+          <w:rFonts w:eastAsia="Garamond"/>
+          <w:sz w:val="22"/>
+          <w:szCs w:val="22"/>
+        </w:rPr>
+        <w:t xml:space="preserve"> </w:t>
+      </w:r>
+      <w:hyperlink r:id="rId14" w:tgtFrame="_blank" w:tooltip="Persistent link using digital object identifier" w:history="1">
+        <w:r>
+          <w:rPr>
+            <w:rStyle w:val="Hyperlink"/>
+            <w:rFonts w:eastAsia="Garamond"/>
+            <w:sz w:val="22"/>
+            <w:szCs w:val="22"/>
+          </w:rPr>
+          <w:t>10.1016/j.actaastro.2026.07.004</w:t>
+        </w:r>
+      </w:hyperlink>
+    </w:p>
+    <w:p>
+      <w:pPr>
+        <w:numPr>
+          <w:ilvl w:val="0"/>
+          <w:numId w:val="13"/>
+        </w:numPr>
+        <w:jc w:val="both"/>
+        <w:rPr>
+          <w:rFonts w:eastAsia="Garamond"/>
+          <w:sz w:val="22"/>
+          <w:szCs w:val="22"/>
+        </w:rPr>
+      </w:pPr>
+      <w:r>
+        <w:rPr>
+          <w:rFonts w:eastAsia="Garamond"/>
+          <w:b/>
+          <w:bCs/>
+          <w:sz w:val="22"/>
+          <w:szCs w:val="22"/>
+        </w:rPr>
+        <w:t>R. Bommena</w:t>
+      </w:r>
+      <w:r>
+        <w:rPr>
+          <w:rFonts w:eastAsia="Garamond"/>
+          <w:sz w:val="22"/>
+          <w:szCs w:val="22"/>
+        </w:rPr>
         <w:t xml:space="preserve">, H. Panag, and R. Woollands, "Optimal 6-DOF Control for Servicing and Assembly at Sun-Earth L2," </w:t>
       </w:r>
       <w:r>
@@ -892,7 +1006,7 @@
         </w:rPr>
         <w:t xml:space="preserve"> </w:t>
       </w:r>
-      <w:hyperlink r:id="rId13" w:history="1">
+      <w:hyperlink r:id="rId15" w:history="1">
         <w:r>
           <w:rPr>
             <w:rStyle w:val="Hyperlink"/>
@@ -969,7 +1083,7 @@
         </w:rPr>
         <w:t xml:space="preserve">6. </w:t>
       </w:r>
-      <w:hyperlink r:id="rId14" w:history="1">
+      <w:hyperlink r:id="rId16" w:history="1">
         <w:r>
           <w:rPr>
             <w:rStyle w:val="Hyperlink"/>
@@ -1087,7 +1201,7 @@
         </w:rPr>
         <w:t xml:space="preserve">. </w:t>
       </w:r>
-      <w:hyperlink r:id="rId15" w:history="1">
+      <w:hyperlink r:id="rId17" w:history="1">
         <w:r>
           <w:rPr>
             <w:rStyle w:val="Hyperlink"/>
@@ -1163,7 +1277,7 @@
         </w:rPr>
         <w:t xml:space="preserve"> </w:t>
       </w:r>
-      <w:hyperlink r:id="rId16" w:tgtFrame="_blank" w:history="1">
+      <w:hyperlink r:id="rId18" w:tgtFrame="_blank" w:history="1">
         <w:r>
           <w:rPr>
             <w:rStyle w:val="Hyperlink"/>
@@ -1245,7 +1359,7 @@
         </w:rPr>
         <w:t xml:space="preserve">, 2024. </w:t>
       </w:r>
-      <w:hyperlink r:id="rId17" w:tgtFrame="_blank" w:history="1">
+      <w:hyperlink r:id="rId19" w:tgtFrame="_blank" w:history="1">
         <w:r>
           <w:rPr>
             <w:rStyle w:val="Hyperlink"/>
@@ -1711,17 +1825,17 @@
           <w:sz w:val="22"/>
           <w:szCs w:val="22"/>
         </w:rPr>
-        <w:t xml:space="preserve">, K. Nagpal, N. Mehr, and R. Woollands, “Optimal Multi-Agent Control and Planning Strategies for In-space Servicing and Assembly,” </w:t>
-      </w:r>
-      <w:r>
-        <w:rPr>
-          <w:rFonts w:eastAsia="Garamond"/>
-          <w:i/>
-          <w:iCs/>
-          <w:sz w:val="22"/>
-          <w:szCs w:val="22"/>
-        </w:rPr>
-        <w:t>Joint Physics of Sensing/Astrodynamics Program Review – Air Force Office of Scientific Research</w:t>
+        <w:t xml:space="preserve"> and R. Woollands, "Fuel-Optimal Multi-Agent Operations with Path Inequality Constraints," </w:t>
+      </w:r>
+      <w:r>
+        <w:rPr>
+          <w:rFonts w:eastAsia="Garamond"/>
+          <w:i/>
+          <w:iCs/>
+          <w:sz w:val="22"/>
+          <w:szCs w:val="22"/>
+        </w:rPr>
+        <w:t>AAS/AIAA Astrodynamics Specialist Conference</w:t>
       </w:r>
       <w:r>
         <w:rPr>
@@ -1730,6 +1844,1970 @@
           <w:szCs w:val="22"/>
         </w:rPr>
         <w:t>, 2024.</w:t>
+      </w:r>
+    </w:p>
+    <w:p>
+      <w:pPr>
+        <w:pBdr>
+          <w:bottom w:val="single" w:sz="4" w:space="1" w:color="000000"/>
+          <w:between w:val="single" w:sz="4" w:space="1" w:color="auto"/>
+        </w:pBdr>
+        <w:jc w:val="both"/>
+        <w:rPr>
+          <w:rFonts w:eastAsia="Garamond"/>
+          <w:sz w:val="22"/>
+          <w:szCs w:val="22"/>
+        </w:rPr>
+      </w:pPr>
+    </w:p>
+    <w:p>
+      <w:pPr>
+        <w:pBdr>
+          <w:bottom w:val="single" w:sz="4" w:space="1" w:color="000000"/>
+          <w:between w:val="single" w:sz="4" w:space="1" w:color="auto"/>
+        </w:pBdr>
+        <w:jc w:val="both"/>
+        <w:rPr>
+          <w:rFonts w:eastAsia="Garamond"/>
+          <w:b/>
+          <w:sz w:val="22"/>
+          <w:szCs w:val="22"/>
+        </w:rPr>
+      </w:pPr>
+      <w:r>
+        <w:rPr>
+          <w:rFonts w:eastAsia="Garamond"/>
+          <w:b/>
+          <w:sz w:val="22"/>
+          <w:szCs w:val="22"/>
+        </w:rPr>
+        <w:t xml:space="preserve">WORK </w:t>
+      </w:r>
+      <w:r>
+        <w:rPr>
+          <w:rFonts w:eastAsia="Garamond"/>
+          <w:b/>
+          <w:sz w:val="22"/>
+          <w:szCs w:val="22"/>
+        </w:rPr>
+        <w:t>EXPERIENCE</w:t>
+      </w:r>
+    </w:p>
+    <w:p>
+      <w:pPr>
+        <w:jc w:val="both"/>
+        <w:rPr>
+          <w:rFonts w:eastAsia="Garamond"/>
+          <w:i/>
+          <w:iCs/>
+          <w:sz w:val="22"/>
+          <w:szCs w:val="22"/>
+        </w:rPr>
+      </w:pPr>
+      <w:r>
+        <w:rPr>
+          <w:rFonts w:eastAsia="Garamond"/>
+          <w:b/>
+          <w:sz w:val="22"/>
+          <w:szCs w:val="22"/>
+        </w:rPr>
+        <w:t xml:space="preserve">Visiting Researcher, </w:t>
+      </w:r>
+      <w:r>
+        <w:rPr>
+          <w:rFonts w:eastAsia="Garamond"/>
+          <w:bCs/>
+          <w:i/>
+          <w:iCs/>
+          <w:sz w:val="22"/>
+          <w:szCs w:val="22"/>
+        </w:rPr>
+        <w:t>NASA Jet Propulsion Laboratory</w:t>
+      </w:r>
+      <w:r>
+        <w:rPr>
+          <w:rFonts w:eastAsia="Garamond"/>
+          <w:bCs/>
+          <w:sz w:val="22"/>
+          <w:szCs w:val="22"/>
+        </w:rPr>
+        <w:t xml:space="preserve">, </w:t>
+      </w:r>
+      <w:r>
+        <w:rPr>
+          <w:rFonts w:eastAsia="Garamond"/>
+          <w:bCs/>
+          <w:sz w:val="22"/>
+          <w:szCs w:val="22"/>
+        </w:rPr>
+        <w:t>Pasadena,</w:t>
+      </w:r>
+      <w:r>
+        <w:rPr>
+          <w:rFonts w:eastAsia="Garamond"/>
+          <w:bCs/>
+          <w:sz w:val="22"/>
+          <w:szCs w:val="22"/>
+        </w:rPr>
+        <w:t xml:space="preserve"> California                                            </w:t>
+      </w:r>
+      <w:r>
+        <w:rPr>
+          <w:rFonts w:eastAsia="Garamond"/>
+          <w:i/>
+          <w:iCs/>
+          <w:sz w:val="22"/>
+          <w:szCs w:val="22"/>
+        </w:rPr>
+        <w:t>June 2026</w:t>
+      </w:r>
+      <w:r>
+        <w:rPr>
+          <w:rFonts w:eastAsia="Garamond"/>
+          <w:i/>
+          <w:iCs/>
+          <w:sz w:val="22"/>
+          <w:szCs w:val="22"/>
+        </w:rPr>
+        <w:t xml:space="preserve"> – Present</w:t>
+      </w:r>
+    </w:p>
+    <w:p>
+      <w:pPr>
+        <w:numPr>
+          <w:ilvl w:val="0"/>
+          <w:numId w:val="1"/>
+        </w:numPr>
+        <w:ind w:hanging="261"/>
+        <w:jc w:val="both"/>
+        <w:rPr>
+          <w:rFonts w:eastAsia="Garamond"/>
+          <w:i/>
+          <w:iCs/>
+          <w:sz w:val="22"/>
+          <w:szCs w:val="22"/>
+        </w:rPr>
+      </w:pPr>
+      <w:r>
+        <w:rPr>
+          <w:rFonts w:eastAsia="Garamond"/>
+          <w:sz w:val="22"/>
+          <w:szCs w:val="22"/>
+        </w:rPr>
+        <w:t>Multi-Agent Robotics Group (358P)</w:t>
+      </w:r>
+    </w:p>
+    <w:p>
+      <w:pPr>
+        <w:jc w:val="both"/>
+        <w:rPr>
+          <w:rFonts w:eastAsia="Garamond"/>
+          <w:b/>
+          <w:sz w:val="22"/>
+          <w:szCs w:val="22"/>
+        </w:rPr>
+      </w:pPr>
+    </w:p>
+    <w:p>
+      <w:pPr>
+        <w:jc w:val="both"/>
+        <w:rPr>
+          <w:rFonts w:eastAsia="Garamond"/>
+          <w:sz w:val="22"/>
+          <w:szCs w:val="22"/>
+        </w:rPr>
+      </w:pPr>
+      <w:r>
+        <w:rPr>
+          <w:rFonts w:eastAsia="Garamond"/>
+          <w:b/>
+          <w:sz w:val="22"/>
+          <w:szCs w:val="22"/>
+        </w:rPr>
+        <w:t xml:space="preserve">Graduate </w:t>
+      </w:r>
+      <w:r>
+        <w:rPr>
+          <w:rFonts w:eastAsia="Garamond"/>
+          <w:b/>
+          <w:sz w:val="22"/>
+          <w:szCs w:val="22"/>
+        </w:rPr>
+        <w:t>Research Assistant</w:t>
+      </w:r>
+      <w:r>
+        <w:rPr>
+          <w:rFonts w:eastAsia="Garamond"/>
+          <w:iCs/>
+          <w:sz w:val="22"/>
+          <w:szCs w:val="22"/>
+        </w:rPr>
+        <w:t>,</w:t>
+      </w:r>
+      <w:r>
+        <w:rPr>
+          <w:rFonts w:eastAsia="Garamond"/>
+          <w:i/>
+          <w:sz w:val="22"/>
+          <w:szCs w:val="22"/>
+        </w:rPr>
+        <w:t xml:space="preserve"> </w:t>
+      </w:r>
+      <w:r>
+        <w:rPr>
+          <w:rFonts w:eastAsia="Garamond"/>
+          <w:bCs/>
+          <w:i/>
+          <w:iCs/>
+          <w:sz w:val="22"/>
+          <w:szCs w:val="22"/>
+        </w:rPr>
+        <w:t>Dept. of Aerospace Engineering UIUC</w:t>
+      </w:r>
+      <w:r>
+        <w:rPr>
+          <w:rFonts w:eastAsia="Garamond"/>
+          <w:sz w:val="22"/>
+          <w:szCs w:val="22"/>
+        </w:rPr>
+        <w:t xml:space="preserve">, Champaign, Illinois            </w:t>
+      </w:r>
+      <w:r>
+        <w:rPr>
+          <w:rFonts w:eastAsia="Garamond"/>
+          <w:sz w:val="22"/>
+          <w:szCs w:val="22"/>
+        </w:rPr>
+        <w:t xml:space="preserve">         </w:t>
+      </w:r>
+      <w:r>
+        <w:rPr>
+          <w:rFonts w:eastAsia="Garamond"/>
+          <w:i/>
+          <w:iCs/>
+          <w:sz w:val="22"/>
+          <w:szCs w:val="22"/>
+        </w:rPr>
+        <w:t>Aug 202</w:t>
+      </w:r>
+      <w:r>
+        <w:rPr>
+          <w:rFonts w:eastAsia="Garamond"/>
+          <w:i/>
+          <w:iCs/>
+          <w:sz w:val="22"/>
+          <w:szCs w:val="22"/>
+        </w:rPr>
+        <w:t>3</w:t>
+      </w:r>
+      <w:r>
+        <w:rPr>
+          <w:rFonts w:eastAsia="Garamond"/>
+          <w:i/>
+          <w:iCs/>
+          <w:sz w:val="22"/>
+          <w:szCs w:val="22"/>
+        </w:rPr>
+        <w:t xml:space="preserve"> – Present</w:t>
+      </w:r>
+    </w:p>
+    <w:p>
+      <w:pPr>
+        <w:numPr>
+          <w:ilvl w:val="0"/>
+          <w:numId w:val="1"/>
+        </w:numPr>
+        <w:jc w:val="both"/>
+        <w:rPr>
+          <w:rFonts w:eastAsia="Garamond"/>
+          <w:sz w:val="22"/>
+          <w:szCs w:val="22"/>
+        </w:rPr>
+      </w:pPr>
+      <w:r>
+        <w:rPr>
+          <w:rFonts w:eastAsia="Garamond"/>
+          <w:sz w:val="22"/>
+          <w:szCs w:val="22"/>
+        </w:rPr>
+        <w:t>Developing</w:t>
+      </w:r>
+      <w:r>
+        <w:rPr>
+          <w:rFonts w:eastAsia="Garamond"/>
+          <w:sz w:val="22"/>
+          <w:szCs w:val="22"/>
+        </w:rPr>
+        <w:t xml:space="preserve"> advanced guidance, navigation, and control</w:t>
+      </w:r>
+      <w:r>
+        <w:rPr>
+          <w:rFonts w:eastAsia="Garamond"/>
+          <w:sz w:val="22"/>
+          <w:szCs w:val="22"/>
+        </w:rPr>
+        <w:t xml:space="preserve"> (GNC)</w:t>
+      </w:r>
+      <w:r>
+        <w:rPr>
+          <w:rFonts w:eastAsia="Garamond"/>
+          <w:sz w:val="22"/>
+          <w:szCs w:val="22"/>
+        </w:rPr>
+        <w:t xml:space="preserve"> algorithms for autonomous spacecraft rendezvous, proximity operations, and in-space servicing missions</w:t>
+      </w:r>
+      <w:r>
+        <w:rPr>
+          <w:rFonts w:eastAsia="Garamond"/>
+          <w:sz w:val="22"/>
+          <w:szCs w:val="22"/>
+        </w:rPr>
+        <w:t xml:space="preserve">, as part of the research conducted in the </w:t>
+      </w:r>
+      <w:r>
+        <w:rPr>
+          <w:rFonts w:eastAsia="Garamond"/>
+          <w:sz w:val="22"/>
+          <w:szCs w:val="22"/>
+        </w:rPr>
+        <w:t>Computation, Optimization, Simulation, and Modeling of Orbiting Spacecraft</w:t>
+      </w:r>
+      <w:r>
+        <w:rPr>
+          <w:rFonts w:eastAsia="Garamond"/>
+          <w:sz w:val="22"/>
+          <w:szCs w:val="22"/>
+        </w:rPr>
+        <w:t xml:space="preserve"> (</w:t>
+      </w:r>
+      <w:hyperlink r:id="rId20" w:history="1">
+        <w:r>
+          <w:rPr>
+            <w:rStyle w:val="Hyperlink"/>
+            <w:rFonts w:eastAsia="Garamond"/>
+            <w:sz w:val="22"/>
+            <w:szCs w:val="22"/>
+          </w:rPr>
+          <w:t>COSMOS</w:t>
+        </w:r>
+      </w:hyperlink>
+      <w:r>
+        <w:rPr>
+          <w:rFonts w:eastAsia="Garamond"/>
+          <w:sz w:val="22"/>
+          <w:szCs w:val="22"/>
+        </w:rPr>
+        <w:t>) laboratory.</w:t>
+      </w:r>
+    </w:p>
+    <w:p>
+      <w:pPr>
+        <w:numPr>
+          <w:ilvl w:val="0"/>
+          <w:numId w:val="1"/>
+        </w:numPr>
+        <w:jc w:val="both"/>
+        <w:rPr>
+          <w:rFonts w:eastAsia="Garamond"/>
+          <w:sz w:val="22"/>
+          <w:szCs w:val="22"/>
+        </w:rPr>
+      </w:pPr>
+      <w:r>
+        <w:rPr>
+          <w:rFonts w:eastAsia="Garamond"/>
+          <w:sz w:val="22"/>
+          <w:szCs w:val="22"/>
+        </w:rPr>
+        <w:t>Design and analyze trajectory optimization methods, including path-constrained 6-DOF maneuver planning for multi-agent spacecraft systems, with emphasis on safety, precision, and fuel efficiency.</w:t>
+      </w:r>
+    </w:p>
+    <w:p>
+      <w:pPr>
+        <w:numPr>
+          <w:ilvl w:val="0"/>
+          <w:numId w:val="1"/>
+        </w:numPr>
+        <w:jc w:val="both"/>
+        <w:rPr>
+          <w:rFonts w:eastAsia="Garamond"/>
+          <w:sz w:val="22"/>
+          <w:szCs w:val="22"/>
+        </w:rPr>
+      </w:pPr>
+      <w:r>
+        <w:rPr>
+          <w:rFonts w:eastAsia="Garamond"/>
+          <w:sz w:val="22"/>
+          <w:szCs w:val="22"/>
+        </w:rPr>
+        <w:lastRenderedPageBreak/>
+        <w:t>Implement and validate indirect optimal control techniques for multi-agent systems, addressing critical path inequality constraints such as thruster-pointing constraints to prevent plume contamination of sensitive instruments of target spacecraft and implementing anti-collision measures for swarm safety.</w:t>
+      </w:r>
+    </w:p>
+    <w:p>
+      <w:pPr>
+        <w:jc w:val="both"/>
+        <w:rPr>
+          <w:rFonts w:eastAsia="Garamond"/>
+          <w:b/>
+          <w:sz w:val="22"/>
+          <w:szCs w:val="22"/>
+        </w:rPr>
+      </w:pPr>
+    </w:p>
+    <w:p>
+      <w:pPr>
+        <w:jc w:val="both"/>
+        <w:rPr>
+          <w:rFonts w:eastAsia="Garamond"/>
+          <w:sz w:val="22"/>
+          <w:szCs w:val="22"/>
+        </w:rPr>
+      </w:pPr>
+      <w:r>
+        <w:rPr>
+          <w:rFonts w:eastAsia="Garamond"/>
+          <w:b/>
+          <w:sz w:val="22"/>
+          <w:szCs w:val="22"/>
+        </w:rPr>
+        <w:t>Flight Dynamics</w:t>
+      </w:r>
+      <w:r>
+        <w:rPr>
+          <w:rFonts w:eastAsia="Garamond"/>
+          <w:b/>
+          <w:sz w:val="22"/>
+          <w:szCs w:val="22"/>
+        </w:rPr>
+        <w:t xml:space="preserve"> Intern</w:t>
+      </w:r>
+      <w:r>
+        <w:rPr>
+          <w:rFonts w:eastAsia="Garamond"/>
+          <w:bCs/>
+          <w:sz w:val="22"/>
+          <w:szCs w:val="22"/>
+        </w:rPr>
+        <w:t>,</w:t>
+      </w:r>
+      <w:r>
+        <w:rPr>
+          <w:rFonts w:eastAsia="Garamond"/>
+          <w:sz w:val="22"/>
+          <w:szCs w:val="22"/>
+        </w:rPr>
+        <w:t xml:space="preserve"> </w:t>
+      </w:r>
+      <w:r>
+        <w:rPr>
+          <w:rFonts w:eastAsia="Garamond"/>
+          <w:bCs/>
+          <w:i/>
+          <w:iCs/>
+          <w:sz w:val="22"/>
+          <w:szCs w:val="22"/>
+        </w:rPr>
+        <w:t>Indian Space Research Organisation</w:t>
+      </w:r>
+      <w:r>
+        <w:rPr>
+          <w:rFonts w:eastAsia="Garamond"/>
+          <w:bCs/>
+          <w:sz w:val="22"/>
+          <w:szCs w:val="22"/>
+        </w:rPr>
+        <w:t>,</w:t>
+      </w:r>
+      <w:r>
+        <w:rPr>
+          <w:rFonts w:eastAsia="Garamond"/>
+          <w:b/>
+          <w:sz w:val="22"/>
+          <w:szCs w:val="22"/>
+        </w:rPr>
+        <w:t xml:space="preserve"> </w:t>
+      </w:r>
+      <w:r>
+        <w:rPr>
+          <w:rFonts w:eastAsia="Garamond"/>
+          <w:sz w:val="22"/>
+          <w:szCs w:val="22"/>
+        </w:rPr>
+        <w:t>Bengaluru</w:t>
+      </w:r>
+      <w:r>
+        <w:rPr>
+          <w:rFonts w:eastAsia="Garamond"/>
+          <w:sz w:val="22"/>
+          <w:szCs w:val="22"/>
+        </w:rPr>
+        <w:t>, India</w:t>
+      </w:r>
+      <w:r>
+        <w:rPr>
+          <w:rFonts w:eastAsia="Garamond"/>
+          <w:sz w:val="22"/>
+          <w:szCs w:val="22"/>
+        </w:rPr>
+        <w:t xml:space="preserve">       </w:t>
+      </w:r>
+      <w:r>
+        <w:rPr>
+          <w:rFonts w:eastAsia="Garamond"/>
+          <w:sz w:val="22"/>
+          <w:szCs w:val="22"/>
+        </w:rPr>
+        <w:t xml:space="preserve">                          </w:t>
+      </w:r>
+      <w:r>
+        <w:rPr>
+          <w:rFonts w:eastAsia="Garamond"/>
+          <w:i/>
+          <w:iCs/>
+          <w:sz w:val="22"/>
+          <w:szCs w:val="22"/>
+        </w:rPr>
+        <w:t>May 202</w:t>
+      </w:r>
+      <w:r>
+        <w:rPr>
+          <w:rFonts w:eastAsia="Garamond"/>
+          <w:i/>
+          <w:iCs/>
+          <w:sz w:val="22"/>
+          <w:szCs w:val="22"/>
+        </w:rPr>
+        <w:t>5</w:t>
+      </w:r>
+      <w:r>
+        <w:rPr>
+          <w:rFonts w:eastAsia="Garamond"/>
+          <w:i/>
+          <w:iCs/>
+          <w:sz w:val="22"/>
+          <w:szCs w:val="22"/>
+        </w:rPr>
+        <w:t xml:space="preserve"> – </w:t>
+      </w:r>
+      <w:r>
+        <w:rPr>
+          <w:rFonts w:eastAsia="Garamond"/>
+          <w:i/>
+          <w:iCs/>
+          <w:sz w:val="22"/>
+          <w:szCs w:val="22"/>
+        </w:rPr>
+        <w:t>July</w:t>
+      </w:r>
+      <w:r>
+        <w:rPr>
+          <w:rFonts w:eastAsia="Garamond"/>
+          <w:i/>
+          <w:iCs/>
+          <w:sz w:val="22"/>
+          <w:szCs w:val="22"/>
+        </w:rPr>
+        <w:t xml:space="preserve"> 202</w:t>
+      </w:r>
+      <w:r>
+        <w:rPr>
+          <w:rFonts w:eastAsia="Garamond"/>
+          <w:i/>
+          <w:iCs/>
+          <w:sz w:val="22"/>
+          <w:szCs w:val="22"/>
+        </w:rPr>
+        <w:t>5</w:t>
+      </w:r>
+    </w:p>
+    <w:p>
+      <w:pPr>
+        <w:numPr>
+          <w:ilvl w:val="0"/>
+          <w:numId w:val="1"/>
+        </w:numPr>
+        <w:ind w:hanging="261"/>
+        <w:jc w:val="both"/>
+        <w:rPr>
+          <w:rFonts w:eastAsia="Garamond"/>
+          <w:sz w:val="22"/>
+          <w:szCs w:val="22"/>
+        </w:rPr>
+      </w:pPr>
+      <w:r>
+        <w:rPr>
+          <w:rFonts w:eastAsia="Garamond"/>
+          <w:sz w:val="22"/>
+          <w:szCs w:val="22"/>
+        </w:rPr>
+        <w:t>De</w:t>
+      </w:r>
+      <w:r>
+        <w:rPr>
+          <w:rFonts w:eastAsia="Garamond"/>
+          <w:sz w:val="22"/>
+          <w:szCs w:val="22"/>
+        </w:rPr>
+        <w:t xml:space="preserve">veloped </w:t>
+      </w:r>
+      <w:r>
+        <w:rPr>
+          <w:rFonts w:eastAsia="Garamond"/>
+          <w:sz w:val="22"/>
+          <w:szCs w:val="22"/>
+        </w:rPr>
+        <w:t>a</w:t>
+      </w:r>
+      <w:r>
+        <w:rPr>
+          <w:rFonts w:eastAsia="Garamond"/>
+          <w:sz w:val="22"/>
+          <w:szCs w:val="22"/>
+        </w:rPr>
+        <w:t xml:space="preserve">n </w:t>
+      </w:r>
+      <w:r>
+        <w:rPr>
+          <w:rFonts w:eastAsia="Garamond"/>
+          <w:sz w:val="22"/>
+          <w:szCs w:val="22"/>
+        </w:rPr>
+        <w:t xml:space="preserve">optimal impulsive trajectory design framework </w:t>
+      </w:r>
+      <w:r>
+        <w:rPr>
+          <w:rFonts w:eastAsia="Garamond"/>
+          <w:sz w:val="22"/>
+          <w:szCs w:val="22"/>
+        </w:rPr>
+        <w:t>for Earth-return missions from lunar orbit</w:t>
+      </w:r>
+      <w:r>
+        <w:rPr>
+          <w:rFonts w:eastAsia="Garamond"/>
+          <w:sz w:val="22"/>
+          <w:szCs w:val="22"/>
+        </w:rPr>
+        <w:t>, at ISRO’s U R Rao Satellite Centre.</w:t>
+      </w:r>
+    </w:p>
+    <w:p>
+      <w:pPr>
+        <w:numPr>
+          <w:ilvl w:val="0"/>
+          <w:numId w:val="1"/>
+        </w:numPr>
+        <w:ind w:hanging="261"/>
+        <w:jc w:val="both"/>
+        <w:rPr>
+          <w:rFonts w:eastAsia="Garamond"/>
+          <w:sz w:val="22"/>
+          <w:szCs w:val="22"/>
+        </w:rPr>
+      </w:pPr>
+      <w:r>
+        <w:rPr>
+          <w:rFonts w:eastAsia="Garamond"/>
+          <w:sz w:val="22"/>
+          <w:szCs w:val="22"/>
+        </w:rPr>
+        <w:t>Developed</w:t>
+      </w:r>
+      <w:r>
+        <w:rPr>
+          <w:rFonts w:eastAsia="Garamond"/>
+          <w:sz w:val="22"/>
+          <w:szCs w:val="22"/>
+        </w:rPr>
+        <w:t xml:space="preserve"> custom MATLAB/Python tools to compute </w:t>
+      </w:r>
+      <w:r>
+        <w:rPr>
+          <w:rFonts w:eastAsia="Garamond"/>
+          <w:sz w:val="22"/>
+          <w:szCs w:val="22"/>
+        </w:rPr>
+        <w:t xml:space="preserve">minimum </w:t>
+      </w:r>
+      <w:r>
+        <w:rPr>
+          <w:rFonts w:eastAsia="Garamond"/>
+          <w:sz w:val="22"/>
+          <w:szCs w:val="22"/>
+        </w:rPr>
+        <w:t xml:space="preserve">ΔV </w:t>
+      </w:r>
+      <w:r>
+        <w:rPr>
+          <w:rFonts w:eastAsia="Garamond"/>
+          <w:sz w:val="22"/>
+          <w:szCs w:val="22"/>
+        </w:rPr>
+        <w:t>transfers, using</w:t>
+      </w:r>
+      <w:r>
+        <w:rPr>
+          <w:rFonts w:eastAsia="Garamond"/>
+          <w:sz w:val="22"/>
+          <w:szCs w:val="22"/>
+        </w:rPr>
+        <w:t xml:space="preserve"> </w:t>
+      </w:r>
+      <w:r>
+        <w:rPr>
+          <w:rFonts w:eastAsia="Garamond"/>
+          <w:sz w:val="22"/>
+          <w:szCs w:val="22"/>
+        </w:rPr>
+        <w:t>optimal control</w:t>
+      </w:r>
+      <w:r>
+        <w:rPr>
+          <w:rFonts w:eastAsia="Garamond"/>
+          <w:sz w:val="22"/>
+          <w:szCs w:val="22"/>
+        </w:rPr>
+        <w:t xml:space="preserve"> theory and </w:t>
+      </w:r>
+      <w:r>
+        <w:rPr>
+          <w:rFonts w:eastAsia="Garamond"/>
+          <w:sz w:val="22"/>
+          <w:szCs w:val="22"/>
+        </w:rPr>
+        <w:t>nonlinear programming,</w:t>
+      </w:r>
+      <w:r>
+        <w:rPr>
+          <w:rFonts w:eastAsia="Garamond"/>
+          <w:sz w:val="22"/>
+          <w:szCs w:val="22"/>
+        </w:rPr>
+        <w:t xml:space="preserve"> while enforcing lunar-departure, Earth-reentry, and dynamical constraints.</w:t>
+      </w:r>
+    </w:p>
+    <w:p>
+      <w:pPr>
+        <w:numPr>
+          <w:ilvl w:val="0"/>
+          <w:numId w:val="1"/>
+        </w:numPr>
+        <w:ind w:hanging="261"/>
+        <w:jc w:val="both"/>
+        <w:rPr>
+          <w:rFonts w:eastAsia="Garamond"/>
+          <w:sz w:val="22"/>
+          <w:szCs w:val="22"/>
+        </w:rPr>
+      </w:pPr>
+      <w:r>
+        <w:rPr>
+          <w:rFonts w:eastAsia="Garamond"/>
+          <w:sz w:val="22"/>
+          <w:szCs w:val="22"/>
+        </w:rPr>
+        <w:t xml:space="preserve">Executed a year-long search for 2027 </w:t>
+      </w:r>
+      <w:r>
+        <w:rPr>
+          <w:rFonts w:eastAsia="Garamond"/>
+          <w:sz w:val="22"/>
+          <w:szCs w:val="22"/>
+        </w:rPr>
+        <w:t xml:space="preserve">to find optimal </w:t>
+      </w:r>
+      <w:r>
+        <w:rPr>
+          <w:rFonts w:eastAsia="Garamond"/>
+          <w:sz w:val="22"/>
+          <w:szCs w:val="22"/>
+        </w:rPr>
+        <w:t>return windows, delivering validated solution sets that support mission planning for ISRO’s upcoming lunar sample-return missions.</w:t>
+      </w:r>
+    </w:p>
+    <w:p>
+      <w:pPr>
+        <w:jc w:val="both"/>
+        <w:rPr>
+          <w:rFonts w:eastAsia="Garamond"/>
+          <w:b/>
+          <w:bCs/>
+          <w:sz w:val="22"/>
+          <w:szCs w:val="22"/>
+        </w:rPr>
+      </w:pPr>
+    </w:p>
+    <w:p>
+      <w:pPr>
+        <w:jc w:val="both"/>
+        <w:rPr>
+          <w:rFonts w:eastAsia="Garamond"/>
+          <w:sz w:val="22"/>
+          <w:szCs w:val="22"/>
+        </w:rPr>
+      </w:pPr>
+      <w:r>
+        <w:rPr>
+          <w:rFonts w:eastAsia="Garamond"/>
+          <w:b/>
+          <w:bCs/>
+          <w:sz w:val="22"/>
+          <w:szCs w:val="22"/>
+        </w:rPr>
+        <w:t>Technical Support Specialist</w:t>
+      </w:r>
+      <w:r>
+        <w:rPr>
+          <w:rFonts w:eastAsia="Garamond"/>
+          <w:sz w:val="22"/>
+          <w:szCs w:val="22"/>
+        </w:rPr>
+        <w:t>,</w:t>
+      </w:r>
+      <w:r>
+        <w:rPr>
+          <w:rFonts w:eastAsia="Garamond"/>
+          <w:i/>
+          <w:iCs/>
+          <w:sz w:val="22"/>
+          <w:szCs w:val="22"/>
+        </w:rPr>
+        <w:t xml:space="preserve"> </w:t>
+      </w:r>
+      <w:r>
+        <w:rPr>
+          <w:rFonts w:eastAsia="Garamond"/>
+          <w:bCs/>
+          <w:i/>
+          <w:iCs/>
+          <w:sz w:val="22"/>
+          <w:szCs w:val="22"/>
+        </w:rPr>
+        <w:t>SHIELD Illinois</w:t>
+      </w:r>
+      <w:r>
+        <w:rPr>
+          <w:rFonts w:eastAsia="Garamond"/>
+          <w:sz w:val="22"/>
+          <w:szCs w:val="22"/>
+        </w:rPr>
+        <w:t>,</w:t>
+      </w:r>
+      <w:r>
+        <w:rPr>
+          <w:rFonts w:eastAsia="Garamond"/>
+          <w:b/>
+          <w:bCs/>
+          <w:sz w:val="22"/>
+          <w:szCs w:val="22"/>
+        </w:rPr>
+        <w:t xml:space="preserve"> </w:t>
+      </w:r>
+      <w:r>
+        <w:rPr>
+          <w:rFonts w:eastAsia="Garamond"/>
+          <w:sz w:val="22"/>
+          <w:szCs w:val="22"/>
+        </w:rPr>
+        <w:t>Champaign, Illinois</w:t>
+      </w:r>
+      <w:r>
+        <w:rPr>
+          <w:rFonts w:eastAsia="Garamond"/>
+          <w:i/>
+          <w:iCs/>
+          <w:sz w:val="22"/>
+          <w:szCs w:val="22"/>
+        </w:rPr>
+        <w:t xml:space="preserve"> </w:t>
+      </w:r>
+      <w:r>
+        <w:rPr>
+          <w:rFonts w:eastAsia="Garamond"/>
+          <w:sz w:val="22"/>
+          <w:szCs w:val="22"/>
+        </w:rPr>
+        <w:tab/>
+        <w:t xml:space="preserve">                 </w:t>
+      </w:r>
+      <w:r>
+        <w:rPr>
+          <w:rFonts w:eastAsia="Garamond"/>
+          <w:sz w:val="22"/>
+          <w:szCs w:val="22"/>
+        </w:rPr>
+        <w:t xml:space="preserve">                          </w:t>
+      </w:r>
+      <w:r>
+        <w:rPr>
+          <w:rFonts w:eastAsia="Garamond"/>
+          <w:i/>
+          <w:iCs/>
+          <w:sz w:val="22"/>
+          <w:szCs w:val="22"/>
+        </w:rPr>
+        <w:t>Nov 2021 – June 2023</w:t>
+      </w:r>
+    </w:p>
+    <w:p>
+      <w:pPr>
+        <w:numPr>
+          <w:ilvl w:val="0"/>
+          <w:numId w:val="1"/>
+        </w:numPr>
+        <w:ind w:hanging="261"/>
+        <w:jc w:val="both"/>
+        <w:rPr>
+          <w:rFonts w:eastAsia="Garamond"/>
+          <w:sz w:val="22"/>
+          <w:szCs w:val="22"/>
+        </w:rPr>
+      </w:pPr>
+      <w:r>
+        <w:rPr>
+          <w:rFonts w:eastAsia="Garamond"/>
+          <w:sz w:val="22"/>
+          <w:szCs w:val="22"/>
+        </w:rPr>
+        <w:t>Provided technical support at SHIELD Illinois, a nonprofit COVID-19 testing organization established by the University of Illinois System during the global pandemic to offer rapid, accurate, and affordable testing.</w:t>
+      </w:r>
+    </w:p>
+    <w:p>
+      <w:pPr>
+        <w:numPr>
+          <w:ilvl w:val="0"/>
+          <w:numId w:val="1"/>
+        </w:numPr>
+        <w:ind w:hanging="261"/>
+        <w:jc w:val="both"/>
+        <w:rPr>
+          <w:rFonts w:eastAsia="Garamond"/>
+          <w:sz w:val="22"/>
+          <w:szCs w:val="22"/>
+        </w:rPr>
+      </w:pPr>
+      <w:r>
+        <w:rPr>
+          <w:rFonts w:eastAsia="Garamond"/>
+          <w:sz w:val="22"/>
+          <w:szCs w:val="22"/>
+        </w:rPr>
+        <w:t>Efficiently addressed and resolved urgent issues and feedback from patients, clients, and partners, managing support tickets and using Point-and-Click software for specimen tracking and client updates.</w:t>
+      </w:r>
+    </w:p>
+    <w:p>
+      <w:pPr>
+        <w:numPr>
+          <w:ilvl w:val="0"/>
+          <w:numId w:val="1"/>
+        </w:numPr>
+        <w:ind w:hanging="261"/>
+        <w:jc w:val="both"/>
+        <w:rPr>
+          <w:rFonts w:eastAsia="Garamond"/>
+          <w:sz w:val="22"/>
+          <w:szCs w:val="22"/>
+        </w:rPr>
+      </w:pPr>
+      <w:r>
+        <w:rPr>
+          <w:rFonts w:eastAsia="Garamond"/>
+          <w:sz w:val="22"/>
+          <w:szCs w:val="22"/>
+        </w:rPr>
+        <w:t>Collaborated effectively with a diverse, multi-cultural team to gather and analyze feedback for service improvement, leading to the identification and implementation of significant updates to the knowledge-base, dedicating extra hours to enhance customer experience.</w:t>
+      </w:r>
+    </w:p>
+    <w:p>
+      <w:pPr>
+        <w:jc w:val="both"/>
+        <w:rPr>
+          <w:rFonts w:eastAsia="Garamond"/>
+          <w:b/>
+          <w:sz w:val="22"/>
+          <w:szCs w:val="22"/>
+        </w:rPr>
+      </w:pPr>
+    </w:p>
+    <w:p>
+      <w:pPr>
+        <w:jc w:val="both"/>
+        <w:rPr>
+          <w:rFonts w:eastAsia="Garamond"/>
+          <w:sz w:val="22"/>
+          <w:szCs w:val="22"/>
+        </w:rPr>
+      </w:pPr>
+      <w:r>
+        <w:rPr>
+          <w:rFonts w:eastAsia="Garamond"/>
+          <w:b/>
+          <w:bCs/>
+          <w:sz w:val="22"/>
+          <w:szCs w:val="22"/>
+        </w:rPr>
+        <w:t>Teaching Assistant</w:t>
+      </w:r>
+      <w:r>
+        <w:rPr>
+          <w:rFonts w:eastAsia="Garamond"/>
+          <w:sz w:val="22"/>
+          <w:szCs w:val="22"/>
+        </w:rPr>
+        <w:t>,</w:t>
+      </w:r>
+      <w:r>
+        <w:rPr>
+          <w:rFonts w:eastAsia="Garamond"/>
+          <w:i/>
+          <w:iCs/>
+          <w:sz w:val="22"/>
+          <w:szCs w:val="22"/>
+        </w:rPr>
+        <w:t xml:space="preserve"> </w:t>
+      </w:r>
+      <w:r>
+        <w:rPr>
+          <w:rFonts w:eastAsia="Garamond"/>
+          <w:bCs/>
+          <w:i/>
+          <w:iCs/>
+          <w:sz w:val="22"/>
+          <w:szCs w:val="22"/>
+        </w:rPr>
+        <w:t>Dept. of Aerospace Engineering UIUC</w:t>
+      </w:r>
+      <w:r>
+        <w:rPr>
+          <w:rFonts w:eastAsia="Garamond"/>
+          <w:sz w:val="22"/>
+          <w:szCs w:val="22"/>
+        </w:rPr>
+        <w:t>,</w:t>
+      </w:r>
+      <w:r>
+        <w:rPr>
+          <w:rFonts w:eastAsia="Garamond"/>
+          <w:b/>
+          <w:bCs/>
+          <w:sz w:val="22"/>
+          <w:szCs w:val="22"/>
+        </w:rPr>
+        <w:t xml:space="preserve"> </w:t>
+      </w:r>
+      <w:r>
+        <w:rPr>
+          <w:rFonts w:eastAsia="Garamond"/>
+          <w:sz w:val="22"/>
+          <w:szCs w:val="22"/>
+        </w:rPr>
+        <w:t>Champaign, Illinois</w:t>
+      </w:r>
+      <w:r>
+        <w:rPr>
+          <w:rFonts w:eastAsia="Garamond"/>
+          <w:i/>
+          <w:iCs/>
+          <w:sz w:val="22"/>
+          <w:szCs w:val="22"/>
+        </w:rPr>
+        <w:t xml:space="preserve">      </w:t>
+      </w:r>
+      <w:r>
+        <w:rPr>
+          <w:rFonts w:eastAsia="Garamond"/>
+          <w:i/>
+          <w:iCs/>
+          <w:sz w:val="22"/>
+          <w:szCs w:val="22"/>
+        </w:rPr>
+        <w:t xml:space="preserve">                            </w:t>
+      </w:r>
+      <w:r>
+        <w:rPr>
+          <w:rFonts w:eastAsia="Garamond"/>
+          <w:i/>
+          <w:iCs/>
+          <w:sz w:val="22"/>
+          <w:szCs w:val="22"/>
+        </w:rPr>
+        <w:t>Aug 2022 – Dec 2022</w:t>
+      </w:r>
+    </w:p>
+    <w:p>
+      <w:pPr>
+        <w:numPr>
+          <w:ilvl w:val="0"/>
+          <w:numId w:val="1"/>
+        </w:numPr>
+        <w:ind w:hanging="261"/>
+        <w:jc w:val="both"/>
+        <w:rPr>
+          <w:rFonts w:eastAsia="Garamond"/>
+          <w:sz w:val="22"/>
+          <w:szCs w:val="22"/>
+        </w:rPr>
+      </w:pPr>
+      <w:r>
+        <w:rPr>
+          <w:rFonts w:eastAsia="Garamond"/>
+          <w:sz w:val="22"/>
+          <w:szCs w:val="22"/>
+        </w:rPr>
+        <w:t>Served as a Graduate Teaching Assistant for the AE 402 – Orbital Mechanics course, playing a key role in facilitating student understanding and engagement with course material.</w:t>
+      </w:r>
+    </w:p>
+    <w:p>
+      <w:pPr>
+        <w:numPr>
+          <w:ilvl w:val="0"/>
+          <w:numId w:val="1"/>
+        </w:numPr>
+        <w:ind w:hanging="261"/>
+        <w:jc w:val="both"/>
+        <w:rPr>
+          <w:rFonts w:eastAsia="Garamond"/>
+          <w:sz w:val="22"/>
+          <w:szCs w:val="22"/>
+        </w:rPr>
+      </w:pPr>
+      <w:r>
+        <w:rPr>
+          <w:rFonts w:eastAsia="Garamond"/>
+          <w:sz w:val="22"/>
+          <w:szCs w:val="22"/>
+        </w:rPr>
+        <w:t>Conducted weekly office hours, offering personalized assistance to students in comprehending lecture content, homework, and exam preparation, alongside the responsibility of grading various assignments to ensure timely and constructive feedback.</w:t>
+      </w:r>
+    </w:p>
+    <w:p>
+      <w:pPr>
+        <w:numPr>
+          <w:ilvl w:val="0"/>
+          <w:numId w:val="1"/>
+        </w:numPr>
+        <w:ind w:hanging="261"/>
+        <w:jc w:val="both"/>
+        <w:rPr>
+          <w:rFonts w:eastAsia="Garamond"/>
+          <w:b/>
+          <w:sz w:val="22"/>
+          <w:szCs w:val="22"/>
+        </w:rPr>
+      </w:pPr>
+      <w:r>
+        <w:rPr>
+          <w:rFonts w:eastAsia="Garamond"/>
+          <w:sz w:val="22"/>
+          <w:szCs w:val="22"/>
+        </w:rPr>
+        <w:t>Took on the responsibility of preparing and delivering comprehensive course material during lectures as required, demonstrating adaptability and a thorough grasp of course concepts.</w:t>
+      </w:r>
+    </w:p>
+    <w:p>
+      <w:pPr>
+        <w:jc w:val="both"/>
+        <w:rPr>
+          <w:rFonts w:eastAsia="Garamond"/>
+          <w:b/>
+          <w:sz w:val="22"/>
+          <w:szCs w:val="22"/>
+        </w:rPr>
+      </w:pPr>
+    </w:p>
+    <w:p>
+      <w:pPr>
+        <w:jc w:val="both"/>
+        <w:rPr>
+          <w:rFonts w:eastAsia="Garamond"/>
+          <w:sz w:val="22"/>
+          <w:szCs w:val="22"/>
+        </w:rPr>
+      </w:pPr>
+      <w:r>
+        <w:rPr>
+          <w:rFonts w:eastAsia="Garamond"/>
+          <w:b/>
+          <w:sz w:val="22"/>
+          <w:szCs w:val="22"/>
+        </w:rPr>
+        <w:t>Mechanical Design Intern</w:t>
+      </w:r>
+      <w:r>
+        <w:rPr>
+          <w:rFonts w:eastAsia="Garamond"/>
+          <w:bCs/>
+          <w:sz w:val="22"/>
+          <w:szCs w:val="22"/>
+        </w:rPr>
+        <w:t>,</w:t>
+      </w:r>
+      <w:r>
+        <w:rPr>
+          <w:rFonts w:eastAsia="Garamond"/>
+          <w:sz w:val="22"/>
+          <w:szCs w:val="22"/>
+        </w:rPr>
+        <w:t xml:space="preserve"> </w:t>
+      </w:r>
+      <w:r>
+        <w:rPr>
+          <w:rFonts w:eastAsia="Garamond"/>
+          <w:bCs/>
+          <w:i/>
+          <w:iCs/>
+          <w:sz w:val="22"/>
+          <w:szCs w:val="22"/>
+        </w:rPr>
+        <w:t>Skyroot Aerospace</w:t>
+      </w:r>
+      <w:r>
+        <w:rPr>
+          <w:rFonts w:eastAsia="Garamond"/>
+          <w:bCs/>
+          <w:sz w:val="22"/>
+          <w:szCs w:val="22"/>
+        </w:rPr>
+        <w:t>,</w:t>
+      </w:r>
+      <w:r>
+        <w:rPr>
+          <w:rFonts w:eastAsia="Garamond"/>
+          <w:b/>
+          <w:sz w:val="22"/>
+          <w:szCs w:val="22"/>
+        </w:rPr>
+        <w:t xml:space="preserve"> </w:t>
+      </w:r>
+      <w:r>
+        <w:rPr>
+          <w:rFonts w:eastAsia="Garamond"/>
+          <w:sz w:val="22"/>
+          <w:szCs w:val="22"/>
+        </w:rPr>
+        <w:t>Hyderabad, India</w:t>
+      </w:r>
+      <w:r>
+        <w:rPr>
+          <w:rFonts w:eastAsia="Garamond"/>
+          <w:sz w:val="22"/>
+          <w:szCs w:val="22"/>
+        </w:rPr>
+        <w:tab/>
+      </w:r>
+      <w:r>
+        <w:rPr>
+          <w:rFonts w:eastAsia="Garamond"/>
+          <w:sz w:val="22"/>
+          <w:szCs w:val="22"/>
+        </w:rPr>
+        <w:t xml:space="preserve">                 </w:t>
+      </w:r>
+      <w:r>
+        <w:rPr>
+          <w:rFonts w:eastAsia="Garamond"/>
+          <w:sz w:val="22"/>
+          <w:szCs w:val="22"/>
+        </w:rPr>
+        <w:t xml:space="preserve">                          </w:t>
+      </w:r>
+      <w:r>
+        <w:rPr>
+          <w:rFonts w:eastAsia="Garamond"/>
+          <w:i/>
+          <w:iCs/>
+          <w:sz w:val="22"/>
+          <w:szCs w:val="22"/>
+        </w:rPr>
+        <w:t>May 2021 – Aug 2021</w:t>
+      </w:r>
+    </w:p>
+    <w:p>
+      <w:pPr>
+        <w:numPr>
+          <w:ilvl w:val="0"/>
+          <w:numId w:val="1"/>
+        </w:numPr>
+        <w:ind w:hanging="261"/>
+        <w:jc w:val="both"/>
+        <w:rPr>
+          <w:rFonts w:eastAsia="Garamond"/>
+          <w:sz w:val="22"/>
+          <w:szCs w:val="22"/>
+        </w:rPr>
+      </w:pPr>
+      <w:r>
+        <w:rPr>
+          <w:rFonts w:eastAsia="Garamond"/>
+          <w:sz w:val="22"/>
+          <w:szCs w:val="22"/>
+        </w:rPr>
+        <w:t>Designed, constructed, and tested a sophisticated ring-type gimbal mount for the Raman-I RCS engine used for attitude control of the Vikram-I rocket.</w:t>
+      </w:r>
+    </w:p>
+    <w:p>
+      <w:pPr>
+        <w:numPr>
+          <w:ilvl w:val="0"/>
+          <w:numId w:val="1"/>
+        </w:numPr>
+        <w:ind w:hanging="261"/>
+        <w:jc w:val="both"/>
+        <w:rPr>
+          <w:rFonts w:eastAsia="Garamond"/>
+          <w:sz w:val="22"/>
+          <w:szCs w:val="22"/>
+        </w:rPr>
+      </w:pPr>
+      <w:r>
+        <w:rPr>
+          <w:sz w:val="22"/>
+          <w:szCs w:val="22"/>
+          <w:shd w:val="clear" w:color="auto" w:fill="FFFFFF"/>
+        </w:rPr>
+        <w:t>Conducted comprehensive material analysis through Finite Element Analysis (FEA) to certify the gimbal's resilience under various structural and thermal loads, ensuring optimal performance and durability, and showcasing a keen understanding of structural and propulsion systems.</w:t>
+      </w:r>
+    </w:p>
+    <w:p>
+      <w:pPr>
+        <w:numPr>
+          <w:ilvl w:val="0"/>
+          <w:numId w:val="1"/>
+        </w:numPr>
+        <w:ind w:hanging="261"/>
+        <w:jc w:val="both"/>
+        <w:rPr>
+          <w:rFonts w:eastAsia="Garamond"/>
+          <w:sz w:val="22"/>
+          <w:szCs w:val="22"/>
+        </w:rPr>
+      </w:pPr>
+      <w:r>
+        <w:rPr>
+          <w:sz w:val="22"/>
+          <w:szCs w:val="22"/>
+          <w:shd w:val="clear" w:color="auto" w:fill="FFFFFF"/>
+        </w:rPr>
+        <w:t>Developed expertise in thrust vectoring systems, honing skills in computer-aided design (CAD) and FEA software, complemented by proficiency in technical report writing and delivering impactful presentations, enhancing project documentation and stakeholder communication</w:t>
+      </w:r>
+      <w:r>
+        <w:rPr>
+          <w:sz w:val="22"/>
+          <w:szCs w:val="22"/>
+          <w:shd w:val="clear" w:color="auto" w:fill="FFFFFF"/>
+        </w:rPr>
+        <w:t>.</w:t>
+      </w:r>
+    </w:p>
+    <w:p>
+      <w:pPr>
+        <w:jc w:val="both"/>
+        <w:rPr>
+          <w:rFonts w:eastAsia="Garamond"/>
+          <w:b/>
+          <w:sz w:val="22"/>
+          <w:szCs w:val="22"/>
+        </w:rPr>
+      </w:pPr>
+    </w:p>
+    <w:p>
+      <w:pPr>
+        <w:jc w:val="both"/>
+        <w:rPr>
+          <w:rFonts w:eastAsia="Garamond"/>
+          <w:sz w:val="22"/>
+          <w:szCs w:val="22"/>
+        </w:rPr>
+      </w:pPr>
+      <w:r>
+        <w:rPr>
+          <w:rFonts w:eastAsia="Garamond"/>
+          <w:b/>
+          <w:sz w:val="22"/>
+          <w:szCs w:val="22"/>
+        </w:rPr>
+        <w:t>Undergraduate Student Assistant</w:t>
+      </w:r>
+      <w:r>
+        <w:rPr>
+          <w:rFonts w:eastAsia="Garamond"/>
+          <w:sz w:val="22"/>
+          <w:szCs w:val="22"/>
+        </w:rPr>
+        <w:t>,</w:t>
+      </w:r>
+      <w:r>
+        <w:rPr>
+          <w:rFonts w:eastAsia="Garamond"/>
+          <w:i/>
+          <w:sz w:val="22"/>
+          <w:szCs w:val="22"/>
+        </w:rPr>
+        <w:t xml:space="preserve"> UIC</w:t>
+      </w:r>
+      <w:r>
+        <w:rPr>
+          <w:rFonts w:eastAsia="Garamond"/>
+          <w:iCs/>
+          <w:sz w:val="22"/>
+          <w:szCs w:val="22"/>
+        </w:rPr>
+        <w:t xml:space="preserve">, </w:t>
+      </w:r>
+      <w:r>
+        <w:rPr>
+          <w:rFonts w:eastAsia="Garamond"/>
+          <w:sz w:val="22"/>
+          <w:szCs w:val="22"/>
+        </w:rPr>
+        <w:t xml:space="preserve">Chicago, Illinois                                          </w:t>
+      </w:r>
+      <w:r>
+        <w:rPr>
+          <w:rFonts w:eastAsia="Garamond"/>
+          <w:sz w:val="22"/>
+          <w:szCs w:val="22"/>
+        </w:rPr>
+        <w:t xml:space="preserve">                          </w:t>
+      </w:r>
+      <w:r>
+        <w:rPr>
+          <w:rFonts w:eastAsia="Garamond"/>
+          <w:i/>
+          <w:iCs/>
+          <w:sz w:val="22"/>
+          <w:szCs w:val="22"/>
+        </w:rPr>
+        <w:t>Sep 2018 – April 2019</w:t>
+      </w:r>
+    </w:p>
+    <w:p>
+      <w:pPr>
+        <w:numPr>
+          <w:ilvl w:val="0"/>
+          <w:numId w:val="1"/>
+        </w:numPr>
+        <w:ind w:hanging="261"/>
+        <w:jc w:val="both"/>
+        <w:rPr>
+          <w:rFonts w:eastAsia="Garamond"/>
+          <w:i/>
+          <w:sz w:val="22"/>
+          <w:szCs w:val="22"/>
+        </w:rPr>
+      </w:pPr>
+      <w:r>
+        <w:rPr>
+          <w:sz w:val="22"/>
+          <w:szCs w:val="22"/>
+          <w:shd w:val="clear" w:color="auto" w:fill="FFFFFF"/>
+        </w:rPr>
+        <w:t>Gained valuable hands-on experience by working in the Machine Shop (subtractive manufacturing lab) and Makerspace (additive manufacturing lab).</w:t>
+      </w:r>
+    </w:p>
+    <w:p>
+      <w:pPr>
+        <w:numPr>
+          <w:ilvl w:val="0"/>
+          <w:numId w:val="1"/>
+        </w:numPr>
+        <w:ind w:hanging="261"/>
+        <w:jc w:val="both"/>
+        <w:rPr>
+          <w:rFonts w:eastAsia="Garamond"/>
+          <w:i/>
+          <w:sz w:val="22"/>
+          <w:szCs w:val="22"/>
+        </w:rPr>
+      </w:pPr>
+      <w:r>
+        <w:rPr>
+          <w:sz w:val="22"/>
+          <w:szCs w:val="22"/>
+          <w:shd w:val="clear" w:color="auto" w:fill="FFFFFF"/>
+        </w:rPr>
+        <w:t>Acquired comprehensive expertise in shop and machine safety, adeptly utilizing computer-aided machining software, and operating a range of machinery including manual and CNC mills and routers, laser cutters, lathes, drill presses, belt sanders, and cutoff saws.</w:t>
+      </w:r>
+    </w:p>
+    <w:p>
+      <w:pPr>
+        <w:numPr>
+          <w:ilvl w:val="0"/>
+          <w:numId w:val="1"/>
+        </w:numPr>
+        <w:ind w:hanging="261"/>
+        <w:jc w:val="both"/>
+        <w:rPr>
+          <w:rFonts w:eastAsia="Garamond"/>
+          <w:i/>
+          <w:sz w:val="22"/>
+          <w:szCs w:val="22"/>
+        </w:rPr>
+      </w:pPr>
+      <w:r>
+        <w:rPr>
+          <w:sz w:val="22"/>
+          <w:szCs w:val="22"/>
+          <w:shd w:val="clear" w:color="auto" w:fill="FFFFFF"/>
+        </w:rPr>
+        <w:t>Developed proficiency in the use of polymeric materials by mastering process-specific lab safety, computer-aided design for 3D printing, executing hands-on 3D printing projects, and applying intricate post-processing procedures.</w:t>
+      </w:r>
+    </w:p>
+    <w:p>
+      <w:pPr>
+        <w:jc w:val="both"/>
+        <w:rPr>
+          <w:rFonts w:eastAsia="Garamond"/>
+          <w:i/>
+          <w:sz w:val="22"/>
+          <w:szCs w:val="22"/>
+        </w:rPr>
+      </w:pPr>
+    </w:p>
+    <w:p>
+      <w:pPr>
+        <w:pBdr>
+          <w:top w:val="single" w:sz="4" w:space="1" w:color="auto"/>
+          <w:bottom w:val="single" w:sz="4" w:space="1" w:color="000000"/>
+          <w:between w:val="single" w:sz="4" w:space="1" w:color="auto"/>
+        </w:pBdr>
+        <w:jc w:val="both"/>
+        <w:rPr>
+          <w:rFonts w:eastAsia="Garamond"/>
+          <w:b/>
+          <w:sz w:val="22"/>
+          <w:szCs w:val="22"/>
+        </w:rPr>
+      </w:pPr>
+      <w:r>
+        <w:rPr>
+          <w:rFonts w:eastAsia="Garamond"/>
+          <w:b/>
+          <w:sz w:val="22"/>
+          <w:szCs w:val="22"/>
+        </w:rPr>
+        <w:t>PROJECTS</w:t>
+      </w:r>
+      <w:r>
+        <w:rPr>
+          <w:rFonts w:eastAsia="Garamond"/>
+          <w:sz w:val="22"/>
+          <w:szCs w:val="22"/>
+        </w:rPr>
+        <w:tab/>
+      </w:r>
+      <w:r>
+        <w:rPr>
+          <w:rFonts w:eastAsia="Garamond"/>
+          <w:sz w:val="22"/>
+          <w:szCs w:val="22"/>
+        </w:rPr>
+        <w:tab/>
+      </w:r>
+      <w:r>
+        <w:rPr>
+          <w:rFonts w:eastAsia="Garamond"/>
+          <w:sz w:val="22"/>
+          <w:szCs w:val="22"/>
+        </w:rPr>
+        <w:tab/>
+      </w:r>
+      <w:r>
+        <w:rPr>
+          <w:rFonts w:eastAsia="Garamond"/>
+          <w:sz w:val="22"/>
+          <w:szCs w:val="22"/>
+        </w:rPr>
+        <w:tab/>
+      </w:r>
+      <w:r>
+        <w:rPr>
+          <w:rFonts w:eastAsia="Garamond"/>
+          <w:sz w:val="22"/>
+          <w:szCs w:val="22"/>
+        </w:rPr>
+        <w:tab/>
+      </w:r>
+      <w:r>
+        <w:rPr>
+          <w:rFonts w:eastAsia="Garamond"/>
+          <w:sz w:val="22"/>
+          <w:szCs w:val="22"/>
+        </w:rPr>
+        <w:tab/>
+      </w:r>
+      <w:r>
+        <w:rPr>
+          <w:rFonts w:eastAsia="Garamond"/>
+          <w:sz w:val="22"/>
+          <w:szCs w:val="22"/>
+        </w:rPr>
+        <w:tab/>
+        <w:t xml:space="preserve">      </w:t>
+      </w:r>
+      <w:r>
+        <w:rPr>
+          <w:rFonts w:eastAsia="Garamond"/>
+          <w:i/>
+          <w:sz w:val="22"/>
+          <w:szCs w:val="22"/>
+        </w:rPr>
+        <w:tab/>
+      </w:r>
+      <w:r>
+        <w:rPr>
+          <w:rFonts w:eastAsia="Garamond"/>
+          <w:i/>
+          <w:sz w:val="22"/>
+          <w:szCs w:val="22"/>
+        </w:rPr>
+        <w:tab/>
+      </w:r>
+    </w:p>
+    <w:p>
+      <w:pPr>
+        <w:jc w:val="both"/>
+        <w:rPr>
+          <w:rFonts w:eastAsia="Garamond"/>
+          <w:sz w:val="22"/>
+          <w:szCs w:val="22"/>
+        </w:rPr>
+      </w:pPr>
+      <w:r>
+        <w:rPr>
+          <w:rFonts w:eastAsia="Garamond"/>
+          <w:b/>
+          <w:sz w:val="22"/>
+          <w:szCs w:val="22"/>
+        </w:rPr>
+        <w:t xml:space="preserve">Graduate </w:t>
+      </w:r>
+      <w:r>
+        <w:rPr>
+          <w:rFonts w:eastAsia="Garamond"/>
+          <w:b/>
+          <w:sz w:val="22"/>
+          <w:szCs w:val="22"/>
+        </w:rPr>
+        <w:t>Research Assistant</w:t>
+      </w:r>
+      <w:r>
+        <w:rPr>
+          <w:rFonts w:eastAsia="Garamond"/>
+          <w:iCs/>
+          <w:sz w:val="22"/>
+          <w:szCs w:val="22"/>
+        </w:rPr>
+        <w:t>,</w:t>
+      </w:r>
+      <w:r>
+        <w:rPr>
+          <w:rFonts w:eastAsia="Garamond"/>
+          <w:i/>
+          <w:sz w:val="22"/>
+          <w:szCs w:val="22"/>
+        </w:rPr>
+        <w:t xml:space="preserve"> </w:t>
+      </w:r>
+      <w:r>
+        <w:rPr>
+          <w:rFonts w:eastAsia="Garamond"/>
+          <w:bCs/>
+          <w:i/>
+          <w:iCs/>
+          <w:sz w:val="22"/>
+          <w:szCs w:val="22"/>
+        </w:rPr>
+        <w:t>NASA STTR Phase 1</w:t>
+      </w:r>
+      <w:r>
+        <w:rPr>
+          <w:rFonts w:eastAsia="Garamond"/>
+          <w:sz w:val="22"/>
+          <w:szCs w:val="22"/>
+        </w:rPr>
+        <w:t xml:space="preserve">, Champaign, Illinois                 </w:t>
+      </w:r>
+      <w:r>
+        <w:rPr>
+          <w:rFonts w:eastAsia="Garamond"/>
+          <w:sz w:val="22"/>
+          <w:szCs w:val="22"/>
+        </w:rPr>
+        <w:t xml:space="preserve"> </w:t>
+      </w:r>
+      <w:r>
+        <w:rPr>
+          <w:rFonts w:eastAsia="Garamond"/>
+          <w:sz w:val="22"/>
+          <w:szCs w:val="22"/>
+        </w:rPr>
+        <w:t xml:space="preserve">                  </w:t>
+      </w:r>
+      <w:r>
+        <w:rPr>
+          <w:rFonts w:eastAsia="Garamond"/>
+          <w:sz w:val="22"/>
+          <w:szCs w:val="22"/>
+        </w:rPr>
+        <w:t xml:space="preserve"> </w:t>
+      </w:r>
+      <w:r>
+        <w:rPr>
+          <w:rFonts w:eastAsia="Garamond"/>
+          <w:sz w:val="22"/>
+          <w:szCs w:val="22"/>
+        </w:rPr>
+        <w:t xml:space="preserve">       </w:t>
+      </w:r>
+      <w:r>
+        <w:rPr>
+          <w:rFonts w:eastAsia="Garamond"/>
+          <w:sz w:val="22"/>
+          <w:szCs w:val="22"/>
+        </w:rPr>
+        <w:t xml:space="preserve"> </w:t>
+      </w:r>
+      <w:r>
+        <w:rPr>
+          <w:rFonts w:eastAsia="Garamond"/>
+          <w:i/>
+          <w:iCs/>
+          <w:sz w:val="22"/>
+          <w:szCs w:val="22"/>
+        </w:rPr>
+        <w:t xml:space="preserve">Aug 2022 – </w:t>
+      </w:r>
+      <w:r>
+        <w:rPr>
+          <w:rFonts w:eastAsia="Garamond"/>
+          <w:i/>
+          <w:iCs/>
+          <w:sz w:val="22"/>
+          <w:szCs w:val="22"/>
+        </w:rPr>
+        <w:t>Aug 2023</w:t>
+      </w:r>
+    </w:p>
+    <w:p>
+      <w:pPr>
+        <w:numPr>
+          <w:ilvl w:val="0"/>
+          <w:numId w:val="1"/>
+        </w:numPr>
+        <w:ind w:hanging="261"/>
+        <w:jc w:val="both"/>
+        <w:rPr>
+          <w:rFonts w:eastAsia="Garamond"/>
+          <w:sz w:val="22"/>
+          <w:szCs w:val="22"/>
+        </w:rPr>
+      </w:pPr>
+      <w:r>
+        <w:rPr>
+          <w:rFonts w:eastAsia="Garamond"/>
+          <w:sz w:val="22"/>
+          <w:szCs w:val="22"/>
+        </w:rPr>
+        <w:t>Led key efforts in a collaborative project with a multi-disciplinary team from NASA Jet Propulsion Laboratory, Ten One Aerospace, and UIUC on "</w:t>
+      </w:r>
+      <w:hyperlink r:id="rId21" w:history="1">
+        <w:r>
+          <w:rPr>
+            <w:rStyle w:val="Hyperlink"/>
+            <w:rFonts w:eastAsia="Garamond"/>
+            <w:sz w:val="22"/>
+            <w:szCs w:val="22"/>
+          </w:rPr>
+          <w:t>Assembly of Large Aperture Space Telescopes in Cislunar Space Using a Swarm of Autonomous Small Satellites</w:t>
+        </w:r>
+      </w:hyperlink>
+      <w:r>
+        <w:rPr>
+          <w:rFonts w:eastAsia="Garamond"/>
+          <w:sz w:val="22"/>
+          <w:szCs w:val="22"/>
+        </w:rPr>
+        <w:t>", as part of a NASA STTR project.</w:t>
+      </w:r>
+    </w:p>
+    <w:p>
+      <w:pPr>
+        <w:numPr>
+          <w:ilvl w:val="0"/>
+          <w:numId w:val="1"/>
+        </w:numPr>
+        <w:ind w:hanging="261"/>
+        <w:jc w:val="both"/>
+        <w:rPr>
+          <w:rFonts w:eastAsia="Garamond"/>
+          <w:sz w:val="22"/>
+          <w:szCs w:val="22"/>
+        </w:rPr>
+      </w:pPr>
+      <w:r>
+        <w:rPr>
+          <w:rFonts w:eastAsia="Garamond"/>
+          <w:sz w:val="22"/>
+          <w:szCs w:val="22"/>
+        </w:rPr>
+        <w:lastRenderedPageBreak/>
+        <w:t xml:space="preserve">Developed and implemented optimal guidance and control algorithms for satellite swarms, contributing to the successful simulations of </w:t>
+      </w:r>
+      <w:r>
+        <w:rPr>
+          <w:rFonts w:eastAsia="Garamond"/>
+          <w:sz w:val="22"/>
+          <w:szCs w:val="22"/>
+        </w:rPr>
+        <w:t>servicing</w:t>
+      </w:r>
+      <w:r>
+        <w:rPr>
+          <w:rFonts w:eastAsia="Garamond"/>
+          <w:sz w:val="22"/>
+          <w:szCs w:val="22"/>
+        </w:rPr>
+        <w:t xml:space="preserve"> operations in cislunar and deep space.</w:t>
+      </w:r>
+    </w:p>
+    <w:p>
+      <w:pPr>
+        <w:numPr>
+          <w:ilvl w:val="0"/>
+          <w:numId w:val="1"/>
+        </w:numPr>
+        <w:ind w:hanging="261"/>
+        <w:jc w:val="both"/>
+        <w:rPr>
+          <w:rFonts w:eastAsia="Garamond"/>
+          <w:sz w:val="22"/>
+          <w:szCs w:val="22"/>
+        </w:rPr>
+      </w:pPr>
+      <w:r>
+        <w:rPr>
+          <w:rFonts w:eastAsia="Garamond"/>
+          <w:sz w:val="22"/>
+          <w:szCs w:val="22"/>
+        </w:rPr>
+        <w:t>Responsible for comprehensive documentation and communication of project developments, including authoring formal reports for project deliverables and conducting bi-weekly technical presentations to update stakeholders on project progress.</w:t>
+      </w:r>
+    </w:p>
+    <w:p>
+      <w:pPr>
+        <w:jc w:val="both"/>
+        <w:rPr>
+          <w:rFonts w:eastAsia="Garamond"/>
+          <w:b/>
+          <w:sz w:val="22"/>
+          <w:szCs w:val="22"/>
+        </w:rPr>
+      </w:pPr>
+    </w:p>
+    <w:p>
+      <w:pPr>
+        <w:jc w:val="both"/>
+        <w:rPr>
+          <w:rFonts w:eastAsia="Garamond"/>
+          <w:sz w:val="22"/>
+          <w:szCs w:val="22"/>
+        </w:rPr>
+      </w:pPr>
+      <w:r>
+        <w:rPr>
+          <w:rFonts w:eastAsia="Garamond"/>
+          <w:b/>
+          <w:sz w:val="22"/>
+          <w:szCs w:val="22"/>
+        </w:rPr>
+        <w:t>Mechanical Design and Analysis Lead</w:t>
+      </w:r>
+      <w:r>
+        <w:rPr>
+          <w:rFonts w:eastAsia="Garamond"/>
+          <w:bCs/>
+          <w:sz w:val="22"/>
+          <w:szCs w:val="22"/>
+        </w:rPr>
+        <w:t xml:space="preserve">, </w:t>
+      </w:r>
+      <w:r>
+        <w:rPr>
+          <w:rFonts w:eastAsia="Garamond"/>
+          <w:bCs/>
+          <w:i/>
+          <w:iCs/>
+          <w:sz w:val="22"/>
+          <w:szCs w:val="22"/>
+        </w:rPr>
+        <w:t>UIC</w:t>
+      </w:r>
+      <w:r>
+        <w:rPr>
+          <w:rFonts w:eastAsia="Garamond"/>
+          <w:bCs/>
+          <w:sz w:val="22"/>
+          <w:szCs w:val="22"/>
+        </w:rPr>
+        <w:t>,</w:t>
+      </w:r>
+      <w:r>
+        <w:rPr>
+          <w:rFonts w:eastAsia="Garamond"/>
+          <w:b/>
+          <w:sz w:val="22"/>
+          <w:szCs w:val="22"/>
+        </w:rPr>
+        <w:t xml:space="preserve"> </w:t>
+      </w:r>
+      <w:r>
+        <w:rPr>
+          <w:rFonts w:eastAsia="Garamond"/>
+          <w:bCs/>
+          <w:sz w:val="22"/>
+          <w:szCs w:val="22"/>
+        </w:rPr>
+        <w:t>Chicago, Illinois</w:t>
+      </w:r>
+      <w:r>
+        <w:rPr>
+          <w:rFonts w:eastAsia="Garamond"/>
+          <w:bCs/>
+          <w:sz w:val="22"/>
+          <w:szCs w:val="22"/>
+        </w:rPr>
+        <w:t xml:space="preserve">    </w:t>
+      </w:r>
+      <w:r>
+        <w:rPr>
+          <w:rFonts w:eastAsia="Garamond"/>
+          <w:bCs/>
+          <w:sz w:val="22"/>
+          <w:szCs w:val="22"/>
+        </w:rPr>
+        <w:t xml:space="preserve">                               </w:t>
+      </w:r>
+      <w:r>
+        <w:rPr>
+          <w:rFonts w:eastAsia="Garamond"/>
+          <w:bCs/>
+          <w:sz w:val="22"/>
+          <w:szCs w:val="22"/>
+        </w:rPr>
+        <w:t xml:space="preserve">                          </w:t>
+      </w:r>
+      <w:r>
+        <w:rPr>
+          <w:rFonts w:eastAsia="Garamond"/>
+          <w:i/>
+          <w:iCs/>
+          <w:sz w:val="22"/>
+          <w:szCs w:val="22"/>
+        </w:rPr>
+        <w:t>Aug 2020 – May 2021</w:t>
       </w:r>
     </w:p>
     <w:p>
@@ -1748,267 +3826,21 @@
         <w:jc w:val="both"/>
         <w:rPr>
           <w:rFonts w:eastAsia="Garamond"/>
-          <w:sz w:val="22"/>
-          <w:szCs w:val="22"/>
-        </w:rPr>
-      </w:pPr>
-      <w:r>
-        <w:rPr>
-          <w:rFonts w:eastAsia="Garamond"/>
-          <w:b/>
-          <w:bCs/>
-          <w:sz w:val="22"/>
-          <w:szCs w:val="22"/>
-        </w:rPr>
-        <w:t>R. Bommena</w:t>
-      </w:r>
-      <w:r>
-        <w:rPr>
-          <w:rFonts w:eastAsia="Garamond"/>
-          <w:sz w:val="22"/>
-          <w:szCs w:val="22"/>
-        </w:rPr>
-        <w:t xml:space="preserve"> and R. Woollands, "Fuel-Optimal Multi-Agent Operations with Path Inequality Constraints," </w:t>
-      </w:r>
-      <w:r>
-        <w:rPr>
-          <w:rFonts w:eastAsia="Garamond"/>
-          <w:i/>
-          <w:iCs/>
-          <w:sz w:val="22"/>
-          <w:szCs w:val="22"/>
-        </w:rPr>
-        <w:t>AAS/AIAA Astrodynamics Specialist Conference</w:t>
-      </w:r>
-      <w:r>
-        <w:rPr>
-          <w:rFonts w:eastAsia="Garamond"/>
-          <w:sz w:val="22"/>
-          <w:szCs w:val="22"/>
-        </w:rPr>
-        <w:t>, 2024.</w:t>
-      </w:r>
-    </w:p>
-    <w:p>
-      <w:pPr>
-        <w:pBdr>
-          <w:bottom w:val="single" w:sz="4" w:space="1" w:color="000000"/>
-          <w:between w:val="single" w:sz="4" w:space="1" w:color="auto"/>
-        </w:pBdr>
-        <w:jc w:val="both"/>
-        <w:rPr>
-          <w:rFonts w:eastAsia="Garamond"/>
-          <w:sz w:val="22"/>
-          <w:szCs w:val="22"/>
-        </w:rPr>
-      </w:pPr>
-    </w:p>
-    <w:p>
-      <w:pPr>
-        <w:pBdr>
-          <w:bottom w:val="single" w:sz="4" w:space="1" w:color="000000"/>
-          <w:between w:val="single" w:sz="4" w:space="1" w:color="auto"/>
-        </w:pBdr>
-        <w:jc w:val="both"/>
-        <w:rPr>
-          <w:rFonts w:eastAsia="Garamond"/>
-          <w:b/>
-          <w:sz w:val="22"/>
-          <w:szCs w:val="22"/>
-        </w:rPr>
-      </w:pPr>
-      <w:r>
-        <w:rPr>
-          <w:rFonts w:eastAsia="Garamond"/>
-          <w:b/>
-          <w:sz w:val="22"/>
-          <w:szCs w:val="22"/>
-        </w:rPr>
-        <w:t xml:space="preserve">WORK </w:t>
-      </w:r>
-      <w:r>
-        <w:rPr>
-          <w:rFonts w:eastAsia="Garamond"/>
-          <w:b/>
-          <w:sz w:val="22"/>
-          <w:szCs w:val="22"/>
-        </w:rPr>
-        <w:t>EXPERIENCE</w:t>
-      </w:r>
-    </w:p>
-    <w:p>
-      <w:pPr>
-        <w:jc w:val="both"/>
-        <w:rPr>
-          <w:rFonts w:eastAsia="Garamond"/>
-          <w:sz w:val="22"/>
-          <w:szCs w:val="22"/>
-        </w:rPr>
-      </w:pPr>
-      <w:r>
-        <w:rPr>
-          <w:rFonts w:eastAsia="Garamond"/>
-          <w:b/>
-          <w:sz w:val="22"/>
-          <w:szCs w:val="22"/>
-        </w:rPr>
-        <w:t xml:space="preserve">Graduate </w:t>
-      </w:r>
-      <w:r>
-        <w:rPr>
-          <w:rFonts w:eastAsia="Garamond"/>
-          <w:b/>
-          <w:sz w:val="22"/>
-          <w:szCs w:val="22"/>
-        </w:rPr>
-        <w:t>Research Assistant</w:t>
-      </w:r>
-      <w:r>
-        <w:rPr>
-          <w:rFonts w:eastAsia="Garamond"/>
-          <w:iCs/>
-          <w:sz w:val="22"/>
-          <w:szCs w:val="22"/>
-        </w:rPr>
-        <w:t>,</w:t>
-      </w:r>
-      <w:r>
-        <w:rPr>
-          <w:rFonts w:eastAsia="Garamond"/>
-          <w:i/>
-          <w:sz w:val="22"/>
-          <w:szCs w:val="22"/>
-        </w:rPr>
-        <w:t xml:space="preserve"> </w:t>
-      </w:r>
-      <w:r>
-        <w:rPr>
-          <w:rFonts w:eastAsia="Garamond"/>
-          <w:bCs/>
-          <w:i/>
-          <w:iCs/>
-          <w:sz w:val="22"/>
-          <w:szCs w:val="22"/>
-        </w:rPr>
-        <w:t>Dept. of Aerospace Engineering UIUC</w:t>
-      </w:r>
-      <w:r>
-        <w:rPr>
-          <w:rFonts w:eastAsia="Garamond"/>
-          <w:sz w:val="22"/>
-          <w:szCs w:val="22"/>
-        </w:rPr>
-        <w:t xml:space="preserve">, Champaign, Illinois            </w:t>
-      </w:r>
-      <w:r>
-        <w:rPr>
-          <w:rFonts w:eastAsia="Garamond"/>
-          <w:sz w:val="22"/>
-          <w:szCs w:val="22"/>
-        </w:rPr>
-        <w:t xml:space="preserve">         </w:t>
-      </w:r>
-      <w:r>
-        <w:rPr>
-          <w:rFonts w:eastAsia="Garamond"/>
-          <w:i/>
-          <w:iCs/>
-          <w:sz w:val="22"/>
-          <w:szCs w:val="22"/>
-        </w:rPr>
-        <w:t>Aug 202</w:t>
-      </w:r>
-      <w:r>
-        <w:rPr>
-          <w:rFonts w:eastAsia="Garamond"/>
-          <w:i/>
-          <w:iCs/>
-          <w:sz w:val="22"/>
-          <w:szCs w:val="22"/>
-        </w:rPr>
-        <w:t>3</w:t>
-      </w:r>
-      <w:r>
-        <w:rPr>
-          <w:rFonts w:eastAsia="Garamond"/>
-          <w:i/>
-          <w:iCs/>
-          <w:sz w:val="22"/>
-          <w:szCs w:val="22"/>
-        </w:rPr>
-        <w:t xml:space="preserve"> – Present</w:t>
-      </w:r>
-    </w:p>
-    <w:p>
-      <w:pPr>
-        <w:numPr>
-          <w:ilvl w:val="0"/>
-          <w:numId w:val="1"/>
-        </w:numPr>
-        <w:jc w:val="both"/>
-        <w:rPr>
-          <w:rFonts w:eastAsia="Garamond"/>
-          <w:sz w:val="22"/>
-          <w:szCs w:val="22"/>
-        </w:rPr>
-      </w:pPr>
-      <w:r>
-        <w:rPr>
-          <w:rFonts w:eastAsia="Garamond"/>
-          <w:sz w:val="22"/>
-          <w:szCs w:val="22"/>
-        </w:rPr>
-        <w:t>Developing</w:t>
-      </w:r>
-      <w:r>
-        <w:rPr>
-          <w:rFonts w:eastAsia="Garamond"/>
-          <w:sz w:val="22"/>
-          <w:szCs w:val="22"/>
-        </w:rPr>
-        <w:t xml:space="preserve"> advanced guidance, navigation, and control</w:t>
-      </w:r>
-      <w:r>
-        <w:rPr>
-          <w:rFonts w:eastAsia="Garamond"/>
-          <w:sz w:val="22"/>
-          <w:szCs w:val="22"/>
-        </w:rPr>
-        <w:t xml:space="preserve"> (GNC)</w:t>
-      </w:r>
-      <w:r>
-        <w:rPr>
-          <w:rFonts w:eastAsia="Garamond"/>
-          <w:sz w:val="22"/>
-          <w:szCs w:val="22"/>
-        </w:rPr>
-        <w:t xml:space="preserve"> algorithms for autonomous spacecraft rendezvous, proximity operations, and in-space servicing missions</w:t>
-      </w:r>
-      <w:r>
-        <w:rPr>
-          <w:rFonts w:eastAsia="Garamond"/>
-          <w:sz w:val="22"/>
-          <w:szCs w:val="22"/>
-        </w:rPr>
-        <w:t xml:space="preserve">, as part of the research conducted in the </w:t>
-      </w:r>
-      <w:r>
-        <w:rPr>
-          <w:rFonts w:eastAsia="Garamond"/>
-          <w:sz w:val="22"/>
-          <w:szCs w:val="22"/>
-        </w:rPr>
-        <w:t>Computation, Optimization, Simulation, and Modeling of Orbiting Spacecraft</w:t>
-      </w:r>
-      <w:r>
-        <w:rPr>
-          <w:rFonts w:eastAsia="Garamond"/>
-          <w:sz w:val="22"/>
-          <w:szCs w:val="22"/>
-        </w:rPr>
-        <w:t xml:space="preserve"> (</w:t>
-      </w:r>
-      <w:hyperlink r:id="rId18" w:history="1">
+          <w:color w:val="000000"/>
+          <w:sz w:val="22"/>
+          <w:szCs w:val="22"/>
+        </w:rPr>
+      </w:pPr>
+      <w:r>
+        <w:rPr>
+          <w:rFonts w:eastAsia="Garamond"/>
+          <w:color w:val="000000"/>
+          <w:sz w:val="22"/>
+          <w:szCs w:val="22"/>
+        </w:rPr>
+        <w:t>Collaborated with senior design team members on the "</w:t>
+      </w:r>
+      <w:hyperlink r:id="rId22" w:history="1">
         <w:r>
           <w:rPr>
             <w:rStyle w:val="Hyperlink"/>
@@ -2016,1625 +3848,26 @@
             <w:sz w:val="22"/>
             <w:szCs w:val="22"/>
           </w:rPr>
-          <w:t>COSMOS</w:t>
+          <w:t>Picture and Video of Earth from the Edge of Space</w:t>
         </w:r>
       </w:hyperlink>
       <w:r>
         <w:rPr>
           <w:rFonts w:eastAsia="Garamond"/>
-          <w:sz w:val="22"/>
-          <w:szCs w:val="22"/>
-        </w:rPr>
-        <w:t>) laboratory.</w:t>
-      </w:r>
-    </w:p>
-    <w:p>
-      <w:pPr>
-        <w:numPr>
-          <w:ilvl w:val="0"/>
-          <w:numId w:val="1"/>
-        </w:numPr>
-        <w:jc w:val="both"/>
-        <w:rPr>
-          <w:rFonts w:eastAsia="Garamond"/>
-          <w:sz w:val="22"/>
-          <w:szCs w:val="22"/>
-        </w:rPr>
-      </w:pPr>
-      <w:r>
-        <w:rPr>
-          <w:rFonts w:eastAsia="Garamond"/>
-          <w:sz w:val="22"/>
-          <w:szCs w:val="22"/>
-        </w:rPr>
-        <w:t>Design and analyze trajectory optimization methods, including path-constrained 6-DOF maneuver planning for multi-agent spacecraft systems, with emphasis on safety, precision, and fuel efficiency.</w:t>
-      </w:r>
-    </w:p>
-    <w:p>
-      <w:pPr>
-        <w:numPr>
-          <w:ilvl w:val="0"/>
-          <w:numId w:val="1"/>
-        </w:numPr>
-        <w:jc w:val="both"/>
-        <w:rPr>
-          <w:rFonts w:eastAsia="Garamond"/>
-          <w:sz w:val="22"/>
-          <w:szCs w:val="22"/>
-        </w:rPr>
-      </w:pPr>
-      <w:r>
-        <w:rPr>
-          <w:rFonts w:eastAsia="Garamond"/>
-          <w:sz w:val="22"/>
-          <w:szCs w:val="22"/>
-        </w:rPr>
-        <w:t>Implement and validate indirect optimal control techniques for multi-agent systems, addressing critical path inequality constraints such as thruster-pointing constraints to prevent plume contamination of sensitive instruments of target spacecraft and implementing anti-collision measures for swarm safety.</w:t>
-      </w:r>
-    </w:p>
-    <w:p>
-      <w:pPr>
-        <w:jc w:val="both"/>
-        <w:rPr>
-          <w:rFonts w:eastAsia="Garamond"/>
-          <w:b/>
-          <w:sz w:val="22"/>
-          <w:szCs w:val="22"/>
-        </w:rPr>
-      </w:pPr>
-    </w:p>
-    <w:p>
-      <w:pPr>
-        <w:jc w:val="both"/>
-        <w:rPr>
-          <w:rFonts w:eastAsia="Garamond"/>
-          <w:sz w:val="22"/>
-          <w:szCs w:val="22"/>
-        </w:rPr>
-      </w:pPr>
-      <w:r>
-        <w:rPr>
-          <w:rFonts w:eastAsia="Garamond"/>
-          <w:b/>
-          <w:sz w:val="22"/>
-          <w:szCs w:val="22"/>
-        </w:rPr>
-        <w:lastRenderedPageBreak/>
-        <w:t>Flight Dynamics</w:t>
-      </w:r>
-      <w:r>
-        <w:rPr>
-          <w:rFonts w:eastAsia="Garamond"/>
-          <w:b/>
-          <w:sz w:val="22"/>
-          <w:szCs w:val="22"/>
-        </w:rPr>
-        <w:t xml:space="preserve"> Intern</w:t>
-      </w:r>
-      <w:r>
-        <w:rPr>
-          <w:rFonts w:eastAsia="Garamond"/>
-          <w:bCs/>
-          <w:sz w:val="22"/>
-          <w:szCs w:val="22"/>
-        </w:rPr>
-        <w:t>,</w:t>
-      </w:r>
-      <w:r>
-        <w:rPr>
-          <w:rFonts w:eastAsia="Garamond"/>
-          <w:sz w:val="22"/>
-          <w:szCs w:val="22"/>
-        </w:rPr>
-        <w:t xml:space="preserve"> </w:t>
-      </w:r>
-      <w:r>
-        <w:rPr>
-          <w:rFonts w:eastAsia="Garamond"/>
-          <w:bCs/>
-          <w:i/>
-          <w:iCs/>
-          <w:sz w:val="22"/>
-          <w:szCs w:val="22"/>
-        </w:rPr>
-        <w:t>Indian Space Research Organisation</w:t>
-      </w:r>
-      <w:r>
-        <w:rPr>
-          <w:rFonts w:eastAsia="Garamond"/>
-          <w:bCs/>
-          <w:sz w:val="22"/>
-          <w:szCs w:val="22"/>
-        </w:rPr>
-        <w:t>,</w:t>
-      </w:r>
-      <w:r>
-        <w:rPr>
-          <w:rFonts w:eastAsia="Garamond"/>
-          <w:b/>
-          <w:sz w:val="22"/>
-          <w:szCs w:val="22"/>
-        </w:rPr>
-        <w:t xml:space="preserve"> </w:t>
-      </w:r>
-      <w:r>
-        <w:rPr>
-          <w:rFonts w:eastAsia="Garamond"/>
-          <w:sz w:val="22"/>
-          <w:szCs w:val="22"/>
-        </w:rPr>
-        <w:t>Bengaluru</w:t>
-      </w:r>
-      <w:r>
-        <w:rPr>
-          <w:rFonts w:eastAsia="Garamond"/>
-          <w:sz w:val="22"/>
-          <w:szCs w:val="22"/>
-        </w:rPr>
-        <w:t>, India</w:t>
-      </w:r>
-      <w:r>
-        <w:rPr>
-          <w:rFonts w:eastAsia="Garamond"/>
-          <w:sz w:val="22"/>
-          <w:szCs w:val="22"/>
-        </w:rPr>
-        <w:t xml:space="preserve">       </w:t>
-      </w:r>
-      <w:r>
-        <w:rPr>
-          <w:rFonts w:eastAsia="Garamond"/>
-          <w:sz w:val="22"/>
-          <w:szCs w:val="22"/>
-        </w:rPr>
-        <w:t xml:space="preserve">                          </w:t>
-      </w:r>
-      <w:r>
-        <w:rPr>
-          <w:rFonts w:eastAsia="Garamond"/>
-          <w:i/>
-          <w:iCs/>
-          <w:sz w:val="22"/>
-          <w:szCs w:val="22"/>
-        </w:rPr>
-        <w:t>May 202</w:t>
-      </w:r>
-      <w:r>
-        <w:rPr>
-          <w:rFonts w:eastAsia="Garamond"/>
-          <w:i/>
-          <w:iCs/>
-          <w:sz w:val="22"/>
-          <w:szCs w:val="22"/>
-        </w:rPr>
-        <w:t>5</w:t>
-      </w:r>
-      <w:r>
-        <w:rPr>
-          <w:rFonts w:eastAsia="Garamond"/>
-          <w:i/>
-          <w:iCs/>
-          <w:sz w:val="22"/>
-          <w:szCs w:val="22"/>
-        </w:rPr>
-        <w:t xml:space="preserve"> – </w:t>
-      </w:r>
-      <w:r>
-        <w:rPr>
-          <w:rFonts w:eastAsia="Garamond"/>
-          <w:i/>
-          <w:iCs/>
-          <w:sz w:val="22"/>
-          <w:szCs w:val="22"/>
-        </w:rPr>
-        <w:t>July</w:t>
-      </w:r>
-      <w:r>
-        <w:rPr>
-          <w:rFonts w:eastAsia="Garamond"/>
-          <w:i/>
-          <w:iCs/>
-          <w:sz w:val="22"/>
-          <w:szCs w:val="22"/>
-        </w:rPr>
-        <w:t xml:space="preserve"> 202</w:t>
-      </w:r>
-      <w:r>
-        <w:rPr>
-          <w:rFonts w:eastAsia="Garamond"/>
-          <w:i/>
-          <w:iCs/>
-          <w:sz w:val="22"/>
-          <w:szCs w:val="22"/>
-        </w:rPr>
-        <w:t>5</w:t>
-      </w:r>
-    </w:p>
-    <w:p>
-      <w:pPr>
-        <w:numPr>
-          <w:ilvl w:val="0"/>
-          <w:numId w:val="1"/>
-        </w:numPr>
-        <w:ind w:hanging="261"/>
-        <w:jc w:val="both"/>
-        <w:rPr>
-          <w:rFonts w:eastAsia="Garamond"/>
-          <w:sz w:val="22"/>
-          <w:szCs w:val="22"/>
-        </w:rPr>
-      </w:pPr>
-      <w:r>
-        <w:rPr>
-          <w:rFonts w:eastAsia="Garamond"/>
-          <w:sz w:val="22"/>
-          <w:szCs w:val="22"/>
-        </w:rPr>
-        <w:t>De</w:t>
-      </w:r>
-      <w:r>
-        <w:rPr>
-          <w:rFonts w:eastAsia="Garamond"/>
-          <w:sz w:val="22"/>
-          <w:szCs w:val="22"/>
-        </w:rPr>
-        <w:t xml:space="preserve">veloped </w:t>
-      </w:r>
-      <w:r>
-        <w:rPr>
-          <w:rFonts w:eastAsia="Garamond"/>
-          <w:sz w:val="22"/>
-          <w:szCs w:val="22"/>
-        </w:rPr>
-        <w:t>a</w:t>
-      </w:r>
-      <w:r>
-        <w:rPr>
-          <w:rFonts w:eastAsia="Garamond"/>
-          <w:sz w:val="22"/>
-          <w:szCs w:val="22"/>
-        </w:rPr>
-        <w:t xml:space="preserve">n </w:t>
-      </w:r>
-      <w:r>
-        <w:rPr>
-          <w:rFonts w:eastAsia="Garamond"/>
-          <w:sz w:val="22"/>
-          <w:szCs w:val="22"/>
-        </w:rPr>
-        <w:t xml:space="preserve">optimal impulsive trajectory design framework </w:t>
-      </w:r>
-      <w:r>
-        <w:rPr>
-          <w:rFonts w:eastAsia="Garamond"/>
-          <w:sz w:val="22"/>
-          <w:szCs w:val="22"/>
-        </w:rPr>
-        <w:t>for Earth-return missions from lunar orbit</w:t>
-      </w:r>
-      <w:r>
-        <w:rPr>
-          <w:rFonts w:eastAsia="Garamond"/>
-          <w:sz w:val="22"/>
-          <w:szCs w:val="22"/>
-        </w:rPr>
-        <w:t>, at ISRO’s U R Rao Satellite Centre.</w:t>
-      </w:r>
-    </w:p>
-    <w:p>
-      <w:pPr>
-        <w:numPr>
-          <w:ilvl w:val="0"/>
-          <w:numId w:val="1"/>
-        </w:numPr>
-        <w:ind w:hanging="261"/>
-        <w:jc w:val="both"/>
-        <w:rPr>
-          <w:rFonts w:eastAsia="Garamond"/>
-          <w:sz w:val="22"/>
-          <w:szCs w:val="22"/>
-        </w:rPr>
-      </w:pPr>
-      <w:r>
-        <w:rPr>
-          <w:rFonts w:eastAsia="Garamond"/>
-          <w:sz w:val="22"/>
-          <w:szCs w:val="22"/>
-        </w:rPr>
-        <w:t>Developed</w:t>
-      </w:r>
-      <w:r>
-        <w:rPr>
-          <w:rFonts w:eastAsia="Garamond"/>
-          <w:sz w:val="22"/>
-          <w:szCs w:val="22"/>
-        </w:rPr>
-        <w:t xml:space="preserve"> custom MATLAB/Python tools to compute </w:t>
-      </w:r>
-      <w:r>
-        <w:rPr>
-          <w:rFonts w:eastAsia="Garamond"/>
-          <w:sz w:val="22"/>
-          <w:szCs w:val="22"/>
-        </w:rPr>
-        <w:t xml:space="preserve">minimum </w:t>
-      </w:r>
-      <w:r>
-        <w:rPr>
-          <w:rFonts w:eastAsia="Garamond"/>
-          <w:sz w:val="22"/>
-          <w:szCs w:val="22"/>
-        </w:rPr>
-        <w:t xml:space="preserve">ΔV </w:t>
-      </w:r>
-      <w:r>
-        <w:rPr>
-          <w:rFonts w:eastAsia="Garamond"/>
-          <w:sz w:val="22"/>
-          <w:szCs w:val="22"/>
-        </w:rPr>
-        <w:t>transfers, using</w:t>
-      </w:r>
-      <w:r>
-        <w:rPr>
-          <w:rFonts w:eastAsia="Garamond"/>
-          <w:sz w:val="22"/>
-          <w:szCs w:val="22"/>
-        </w:rPr>
-        <w:t xml:space="preserve"> </w:t>
-      </w:r>
-      <w:r>
-        <w:rPr>
-          <w:rFonts w:eastAsia="Garamond"/>
-          <w:sz w:val="22"/>
-          <w:szCs w:val="22"/>
-        </w:rPr>
-        <w:t>optimal control</w:t>
-      </w:r>
-      <w:r>
-        <w:rPr>
-          <w:rFonts w:eastAsia="Garamond"/>
-          <w:sz w:val="22"/>
-          <w:szCs w:val="22"/>
-        </w:rPr>
-        <w:t xml:space="preserve"> theory and </w:t>
-      </w:r>
-      <w:r>
-        <w:rPr>
-          <w:rFonts w:eastAsia="Garamond"/>
-          <w:sz w:val="22"/>
-          <w:szCs w:val="22"/>
-        </w:rPr>
-        <w:t>nonlinear programming,</w:t>
-      </w:r>
-      <w:r>
-        <w:rPr>
-          <w:rFonts w:eastAsia="Garamond"/>
-          <w:sz w:val="22"/>
-          <w:szCs w:val="22"/>
-        </w:rPr>
-        <w:t xml:space="preserve"> while enforcing lunar-departure, Earth-reentry, and dynamical constraints.</w:t>
-      </w:r>
-    </w:p>
-    <w:p>
-      <w:pPr>
-        <w:numPr>
-          <w:ilvl w:val="0"/>
-          <w:numId w:val="1"/>
-        </w:numPr>
-        <w:ind w:hanging="261"/>
-        <w:jc w:val="both"/>
-        <w:rPr>
-          <w:rFonts w:eastAsia="Garamond"/>
-          <w:sz w:val="22"/>
-          <w:szCs w:val="22"/>
-        </w:rPr>
-      </w:pPr>
-      <w:r>
-        <w:rPr>
-          <w:rFonts w:eastAsia="Garamond"/>
-          <w:sz w:val="22"/>
-          <w:szCs w:val="22"/>
-        </w:rPr>
-        <w:t xml:space="preserve">Executed a year-long search for 2027 </w:t>
-      </w:r>
-      <w:r>
-        <w:rPr>
-          <w:rFonts w:eastAsia="Garamond"/>
-          <w:sz w:val="22"/>
-          <w:szCs w:val="22"/>
-        </w:rPr>
-        <w:t xml:space="preserve">to find optimal </w:t>
-      </w:r>
-      <w:r>
-        <w:rPr>
-          <w:rFonts w:eastAsia="Garamond"/>
-          <w:sz w:val="22"/>
-          <w:szCs w:val="22"/>
-        </w:rPr>
-        <w:t>return windows, delivering validated solution sets that support mission planning for ISRO’s upcoming lunar sample-return missions.</w:t>
-      </w:r>
-    </w:p>
-    <w:p>
-      <w:pPr>
-        <w:jc w:val="both"/>
-        <w:rPr>
-          <w:rFonts w:eastAsia="Garamond"/>
-          <w:b/>
-          <w:bCs/>
-          <w:sz w:val="22"/>
-          <w:szCs w:val="22"/>
-        </w:rPr>
-      </w:pPr>
-    </w:p>
-    <w:p>
-      <w:pPr>
-        <w:jc w:val="both"/>
-        <w:rPr>
-          <w:rFonts w:eastAsia="Garamond"/>
-          <w:sz w:val="22"/>
-          <w:szCs w:val="22"/>
-        </w:rPr>
-      </w:pPr>
-      <w:r>
-        <w:rPr>
-          <w:rFonts w:eastAsia="Garamond"/>
-          <w:b/>
-          <w:bCs/>
-          <w:sz w:val="22"/>
-          <w:szCs w:val="22"/>
-        </w:rPr>
-        <w:t>Technical Support Specialist</w:t>
-      </w:r>
-      <w:r>
-        <w:rPr>
-          <w:rFonts w:eastAsia="Garamond"/>
-          <w:sz w:val="22"/>
-          <w:szCs w:val="22"/>
-        </w:rPr>
-        <w:t>,</w:t>
-      </w:r>
-      <w:r>
-        <w:rPr>
-          <w:rFonts w:eastAsia="Garamond"/>
-          <w:i/>
-          <w:iCs/>
-          <w:sz w:val="22"/>
-          <w:szCs w:val="22"/>
-        </w:rPr>
-        <w:t xml:space="preserve"> </w:t>
-      </w:r>
-      <w:r>
-        <w:rPr>
-          <w:rFonts w:eastAsia="Garamond"/>
-          <w:bCs/>
-          <w:i/>
-          <w:iCs/>
-          <w:sz w:val="22"/>
-          <w:szCs w:val="22"/>
-        </w:rPr>
-        <w:t>SHIELD Illinois</w:t>
-      </w:r>
-      <w:r>
-        <w:rPr>
-          <w:rFonts w:eastAsia="Garamond"/>
-          <w:sz w:val="22"/>
-          <w:szCs w:val="22"/>
-        </w:rPr>
-        <w:t>,</w:t>
-      </w:r>
-      <w:r>
-        <w:rPr>
-          <w:rFonts w:eastAsia="Garamond"/>
-          <w:b/>
-          <w:bCs/>
-          <w:sz w:val="22"/>
-          <w:szCs w:val="22"/>
-        </w:rPr>
-        <w:t xml:space="preserve"> </w:t>
-      </w:r>
-      <w:r>
-        <w:rPr>
-          <w:rFonts w:eastAsia="Garamond"/>
-          <w:sz w:val="22"/>
-          <w:szCs w:val="22"/>
-        </w:rPr>
-        <w:t>Champaign, Illinois</w:t>
-      </w:r>
-      <w:r>
-        <w:rPr>
-          <w:rFonts w:eastAsia="Garamond"/>
-          <w:i/>
-          <w:iCs/>
-          <w:sz w:val="22"/>
-          <w:szCs w:val="22"/>
-        </w:rPr>
-        <w:t xml:space="preserve"> </w:t>
-      </w:r>
-      <w:r>
-        <w:rPr>
-          <w:rFonts w:eastAsia="Garamond"/>
-          <w:sz w:val="22"/>
-          <w:szCs w:val="22"/>
-        </w:rPr>
-        <w:tab/>
-        <w:t xml:space="preserve">                 </w:t>
-      </w:r>
-      <w:r>
-        <w:rPr>
-          <w:rFonts w:eastAsia="Garamond"/>
-          <w:sz w:val="22"/>
-          <w:szCs w:val="22"/>
-        </w:rPr>
-        <w:t xml:space="preserve">                          </w:t>
-      </w:r>
-      <w:r>
-        <w:rPr>
-          <w:rFonts w:eastAsia="Garamond"/>
-          <w:i/>
-          <w:iCs/>
-          <w:sz w:val="22"/>
-          <w:szCs w:val="22"/>
-        </w:rPr>
-        <w:t>Nov 2021 – June 2023</w:t>
-      </w:r>
-    </w:p>
-    <w:p>
-      <w:pPr>
-        <w:numPr>
-          <w:ilvl w:val="0"/>
-          <w:numId w:val="1"/>
-        </w:numPr>
-        <w:ind w:hanging="261"/>
-        <w:jc w:val="both"/>
-        <w:rPr>
-          <w:rFonts w:eastAsia="Garamond"/>
-          <w:sz w:val="22"/>
-          <w:szCs w:val="22"/>
-        </w:rPr>
-      </w:pPr>
-      <w:r>
-        <w:rPr>
-          <w:rFonts w:eastAsia="Garamond"/>
-          <w:sz w:val="22"/>
-          <w:szCs w:val="22"/>
-        </w:rPr>
-        <w:t>Provided technical support at SHIELD Illinois, a nonprofit COVID-19 testing organization established by the University of Illinois System during the global pandemic to offer rapid, accurate, and affordable testing.</w:t>
-      </w:r>
-    </w:p>
-    <w:p>
-      <w:pPr>
-        <w:numPr>
-          <w:ilvl w:val="0"/>
-          <w:numId w:val="1"/>
-        </w:numPr>
-        <w:ind w:hanging="261"/>
-        <w:jc w:val="both"/>
-        <w:rPr>
-          <w:rFonts w:eastAsia="Garamond"/>
-          <w:sz w:val="22"/>
-          <w:szCs w:val="22"/>
-        </w:rPr>
-      </w:pPr>
-      <w:r>
-        <w:rPr>
-          <w:rFonts w:eastAsia="Garamond"/>
-          <w:sz w:val="22"/>
-          <w:szCs w:val="22"/>
-        </w:rPr>
-        <w:t>Efficiently addressed and resolved urgent issues and feedback from patients, clients, and partners, managing support tickets and using Point-and-Click software for specimen tracking and client updates.</w:t>
-      </w:r>
-    </w:p>
-    <w:p>
-      <w:pPr>
-        <w:numPr>
-          <w:ilvl w:val="0"/>
-          <w:numId w:val="1"/>
-        </w:numPr>
-        <w:ind w:hanging="261"/>
-        <w:jc w:val="both"/>
-        <w:rPr>
-          <w:rFonts w:eastAsia="Garamond"/>
-          <w:sz w:val="22"/>
-          <w:szCs w:val="22"/>
-        </w:rPr>
-      </w:pPr>
-      <w:r>
-        <w:rPr>
-          <w:rFonts w:eastAsia="Garamond"/>
-          <w:sz w:val="22"/>
-          <w:szCs w:val="22"/>
-        </w:rPr>
-        <w:t>Collaborated effectively with a diverse, multi-cultural team to gather and analyze feedback for service improvement, leading to the identification and implementation of significant updates to the knowledge-base, dedicating extra hours to enhance customer experience.</w:t>
-      </w:r>
-    </w:p>
-    <w:p>
-      <w:pPr>
-        <w:jc w:val="both"/>
-        <w:rPr>
-          <w:rFonts w:eastAsia="Garamond"/>
-          <w:b/>
-          <w:sz w:val="22"/>
-          <w:szCs w:val="22"/>
-        </w:rPr>
-      </w:pPr>
-    </w:p>
-    <w:p>
-      <w:pPr>
-        <w:jc w:val="both"/>
-        <w:rPr>
-          <w:rFonts w:eastAsia="Garamond"/>
-          <w:sz w:val="22"/>
-          <w:szCs w:val="22"/>
-        </w:rPr>
-      </w:pPr>
-      <w:r>
-        <w:rPr>
-          <w:rFonts w:eastAsia="Garamond"/>
-          <w:b/>
-          <w:bCs/>
-          <w:sz w:val="22"/>
-          <w:szCs w:val="22"/>
-        </w:rPr>
-        <w:t>Teaching Assistant</w:t>
-      </w:r>
-      <w:r>
-        <w:rPr>
-          <w:rFonts w:eastAsia="Garamond"/>
-          <w:sz w:val="22"/>
-          <w:szCs w:val="22"/>
-        </w:rPr>
-        <w:t>,</w:t>
-      </w:r>
-      <w:r>
-        <w:rPr>
-          <w:rFonts w:eastAsia="Garamond"/>
-          <w:i/>
-          <w:iCs/>
-          <w:sz w:val="22"/>
-          <w:szCs w:val="22"/>
-        </w:rPr>
-        <w:t xml:space="preserve"> </w:t>
-      </w:r>
-      <w:r>
-        <w:rPr>
-          <w:rFonts w:eastAsia="Garamond"/>
-          <w:bCs/>
-          <w:i/>
-          <w:iCs/>
-          <w:sz w:val="22"/>
-          <w:szCs w:val="22"/>
-        </w:rPr>
-        <w:t>Dept. of Aerospace Engineering UIUC</w:t>
-      </w:r>
-      <w:r>
-        <w:rPr>
-          <w:rFonts w:eastAsia="Garamond"/>
-          <w:sz w:val="22"/>
-          <w:szCs w:val="22"/>
-        </w:rPr>
-        <w:t>,</w:t>
-      </w:r>
-      <w:r>
-        <w:rPr>
-          <w:rFonts w:eastAsia="Garamond"/>
-          <w:b/>
-          <w:bCs/>
-          <w:sz w:val="22"/>
-          <w:szCs w:val="22"/>
-        </w:rPr>
-        <w:t xml:space="preserve"> </w:t>
-      </w:r>
-      <w:r>
-        <w:rPr>
-          <w:rFonts w:eastAsia="Garamond"/>
-          <w:sz w:val="22"/>
-          <w:szCs w:val="22"/>
-        </w:rPr>
-        <w:t>Champaign, Illinois</w:t>
-      </w:r>
-      <w:r>
-        <w:rPr>
-          <w:rFonts w:eastAsia="Garamond"/>
-          <w:i/>
-          <w:iCs/>
-          <w:sz w:val="22"/>
-          <w:szCs w:val="22"/>
-        </w:rPr>
-        <w:t xml:space="preserve">      </w:t>
-      </w:r>
-      <w:r>
-        <w:rPr>
-          <w:rFonts w:eastAsia="Garamond"/>
-          <w:i/>
-          <w:iCs/>
-          <w:sz w:val="22"/>
-          <w:szCs w:val="22"/>
-        </w:rPr>
-        <w:t xml:space="preserve">                            </w:t>
-      </w:r>
-      <w:r>
-        <w:rPr>
-          <w:rFonts w:eastAsia="Garamond"/>
-          <w:i/>
-          <w:iCs/>
-          <w:sz w:val="22"/>
-          <w:szCs w:val="22"/>
-        </w:rPr>
-        <w:t>Aug 2022 – Dec 2022</w:t>
-      </w:r>
-    </w:p>
-    <w:p>
-      <w:pPr>
-        <w:numPr>
-          <w:ilvl w:val="0"/>
-          <w:numId w:val="1"/>
-        </w:numPr>
-        <w:ind w:hanging="261"/>
-        <w:jc w:val="both"/>
-        <w:rPr>
-          <w:rFonts w:eastAsia="Garamond"/>
-          <w:sz w:val="22"/>
-          <w:szCs w:val="22"/>
-        </w:rPr>
-      </w:pPr>
-      <w:r>
-        <w:rPr>
-          <w:rFonts w:eastAsia="Garamond"/>
-          <w:sz w:val="22"/>
-          <w:szCs w:val="22"/>
-        </w:rPr>
-        <w:t>Served as a Graduate Teaching Assistant for the AE 402 – Orbital Mechanics course, playing a key role in facilitating student understanding and engagement with course material.</w:t>
-      </w:r>
-    </w:p>
-    <w:p>
-      <w:pPr>
-        <w:numPr>
-          <w:ilvl w:val="0"/>
-          <w:numId w:val="1"/>
-        </w:numPr>
-        <w:ind w:hanging="261"/>
-        <w:jc w:val="both"/>
-        <w:rPr>
-          <w:rFonts w:eastAsia="Garamond"/>
-          <w:sz w:val="22"/>
-          <w:szCs w:val="22"/>
-        </w:rPr>
-      </w:pPr>
-      <w:r>
-        <w:rPr>
-          <w:rFonts w:eastAsia="Garamond"/>
-          <w:sz w:val="22"/>
-          <w:szCs w:val="22"/>
-        </w:rPr>
-        <w:t>Conducted weekly office hours, offering personalized assistance to students in comprehending lecture content, homework, and exam preparation, alongside the responsibility of grading various assignments to ensure timely and constructive feedback.</w:t>
-      </w:r>
-    </w:p>
-    <w:p>
-      <w:pPr>
-        <w:numPr>
-          <w:ilvl w:val="0"/>
-          <w:numId w:val="1"/>
-        </w:numPr>
-        <w:ind w:hanging="261"/>
-        <w:jc w:val="both"/>
-        <w:rPr>
-          <w:rFonts w:eastAsia="Garamond"/>
-          <w:b/>
-          <w:sz w:val="22"/>
-          <w:szCs w:val="22"/>
-        </w:rPr>
-      </w:pPr>
-      <w:r>
-        <w:rPr>
-          <w:rFonts w:eastAsia="Garamond"/>
-          <w:sz w:val="22"/>
-          <w:szCs w:val="22"/>
-        </w:rPr>
-        <w:t>Took on the responsibility of preparing and delivering comprehensive course material during lectures as required, demonstrating adaptability and a thorough grasp of course concepts.</w:t>
-      </w:r>
-    </w:p>
-    <w:p>
-      <w:pPr>
-        <w:jc w:val="both"/>
-        <w:rPr>
-          <w:rFonts w:eastAsia="Garamond"/>
-          <w:b/>
-          <w:sz w:val="22"/>
-          <w:szCs w:val="22"/>
-        </w:rPr>
-      </w:pPr>
-    </w:p>
-    <w:p>
-      <w:pPr>
-        <w:jc w:val="both"/>
-        <w:rPr>
-          <w:rFonts w:eastAsia="Garamond"/>
-          <w:sz w:val="22"/>
-          <w:szCs w:val="22"/>
-        </w:rPr>
-      </w:pPr>
-      <w:r>
-        <w:rPr>
-          <w:rFonts w:eastAsia="Garamond"/>
-          <w:b/>
-          <w:sz w:val="22"/>
-          <w:szCs w:val="22"/>
-        </w:rPr>
-        <w:t>Mechanical Design Intern</w:t>
-      </w:r>
-      <w:r>
-        <w:rPr>
-          <w:rFonts w:eastAsia="Garamond"/>
-          <w:bCs/>
-          <w:sz w:val="22"/>
-          <w:szCs w:val="22"/>
-        </w:rPr>
-        <w:t>,</w:t>
-      </w:r>
-      <w:r>
-        <w:rPr>
-          <w:rFonts w:eastAsia="Garamond"/>
-          <w:sz w:val="22"/>
-          <w:szCs w:val="22"/>
-        </w:rPr>
-        <w:t xml:space="preserve"> </w:t>
-      </w:r>
-      <w:r>
-        <w:rPr>
-          <w:rFonts w:eastAsia="Garamond"/>
-          <w:bCs/>
-          <w:i/>
-          <w:iCs/>
-          <w:sz w:val="22"/>
-          <w:szCs w:val="22"/>
-        </w:rPr>
-        <w:t>Skyroot Aerospace</w:t>
-      </w:r>
-      <w:r>
-        <w:rPr>
-          <w:rFonts w:eastAsia="Garamond"/>
-          <w:bCs/>
-          <w:sz w:val="22"/>
-          <w:szCs w:val="22"/>
-        </w:rPr>
-        <w:t>,</w:t>
-      </w:r>
-      <w:r>
-        <w:rPr>
-          <w:rFonts w:eastAsia="Garamond"/>
-          <w:b/>
-          <w:sz w:val="22"/>
-          <w:szCs w:val="22"/>
-        </w:rPr>
-        <w:t xml:space="preserve"> </w:t>
-      </w:r>
-      <w:r>
-        <w:rPr>
-          <w:rFonts w:eastAsia="Garamond"/>
-          <w:sz w:val="22"/>
-          <w:szCs w:val="22"/>
-        </w:rPr>
-        <w:t>Hyderabad, India</w:t>
-      </w:r>
-      <w:r>
-        <w:rPr>
-          <w:rFonts w:eastAsia="Garamond"/>
-          <w:sz w:val="22"/>
-          <w:szCs w:val="22"/>
-        </w:rPr>
-        <w:tab/>
-      </w:r>
-      <w:r>
-        <w:rPr>
-          <w:rFonts w:eastAsia="Garamond"/>
-          <w:sz w:val="22"/>
-          <w:szCs w:val="22"/>
-        </w:rPr>
-        <w:t xml:space="preserve">                 </w:t>
-      </w:r>
-      <w:r>
-        <w:rPr>
-          <w:rFonts w:eastAsia="Garamond"/>
-          <w:sz w:val="22"/>
-          <w:szCs w:val="22"/>
-        </w:rPr>
-        <w:t xml:space="preserve">                          </w:t>
-      </w:r>
-      <w:r>
-        <w:rPr>
-          <w:rFonts w:eastAsia="Garamond"/>
-          <w:i/>
-          <w:iCs/>
-          <w:sz w:val="22"/>
-          <w:szCs w:val="22"/>
-        </w:rPr>
-        <w:t>May 2021 – Aug 2021</w:t>
-      </w:r>
-    </w:p>
-    <w:p>
-      <w:pPr>
-        <w:numPr>
-          <w:ilvl w:val="0"/>
-          <w:numId w:val="1"/>
-        </w:numPr>
-        <w:ind w:hanging="261"/>
-        <w:jc w:val="both"/>
-        <w:rPr>
-          <w:rFonts w:eastAsia="Garamond"/>
-          <w:sz w:val="22"/>
-          <w:szCs w:val="22"/>
-        </w:rPr>
-      </w:pPr>
-      <w:r>
-        <w:rPr>
-          <w:rFonts w:eastAsia="Garamond"/>
-          <w:sz w:val="22"/>
-          <w:szCs w:val="22"/>
-        </w:rPr>
-        <w:t>Designed, constructed, and tested a sophisticated ring-type gimbal mount for the Raman-I RCS engine used for attitude control of the Vikram-I rocket.</w:t>
-      </w:r>
-    </w:p>
-    <w:p>
-      <w:pPr>
-        <w:numPr>
-          <w:ilvl w:val="0"/>
-          <w:numId w:val="1"/>
-        </w:numPr>
-        <w:ind w:hanging="261"/>
-        <w:jc w:val="both"/>
-        <w:rPr>
-          <w:rFonts w:eastAsia="Garamond"/>
-          <w:sz w:val="22"/>
-          <w:szCs w:val="22"/>
-        </w:rPr>
-      </w:pPr>
-      <w:r>
-        <w:rPr>
-          <w:sz w:val="22"/>
-          <w:szCs w:val="22"/>
-          <w:shd w:val="clear" w:color="auto" w:fill="FFFFFF"/>
-        </w:rPr>
-        <w:t>Conducted comprehensive material analysis through Finite Element Analysis (FEA) to certify the gimbal's resilience under various structural and thermal loads, ensuring optimal performance and durability, and showcasing a keen understanding of structural and propulsion systems.</w:t>
-      </w:r>
-    </w:p>
-    <w:p>
-      <w:pPr>
-        <w:numPr>
-          <w:ilvl w:val="0"/>
-          <w:numId w:val="1"/>
-        </w:numPr>
-        <w:ind w:hanging="261"/>
-        <w:jc w:val="both"/>
-        <w:rPr>
-          <w:rFonts w:eastAsia="Garamond"/>
-          <w:sz w:val="22"/>
-          <w:szCs w:val="22"/>
-        </w:rPr>
-      </w:pPr>
-      <w:r>
-        <w:rPr>
-          <w:sz w:val="22"/>
-          <w:szCs w:val="22"/>
-          <w:shd w:val="clear" w:color="auto" w:fill="FFFFFF"/>
-        </w:rPr>
-        <w:t>Developed expertise in thrust vectoring systems, honing skills in computer-aided design (CAD) and FEA software, complemented by proficiency in technical report writing and delivering impactful presentations, enhancing project documentation and stakeholder communication</w:t>
-      </w:r>
-      <w:r>
-        <w:rPr>
-          <w:sz w:val="22"/>
-          <w:szCs w:val="22"/>
-          <w:shd w:val="clear" w:color="auto" w:fill="FFFFFF"/>
+          <w:color w:val="000000"/>
+          <w:sz w:val="22"/>
+          <w:szCs w:val="22"/>
+        </w:rPr>
+        <w:t>" project, developing a craft capable of carrying a high-altitude balloon to the edge of space, equipped with onboard cameras to capture the entire journey from launch to landing</w:t>
+      </w:r>
+      <w:r>
+        <w:rPr>
+          <w:rFonts w:eastAsia="Garamond"/>
+          <w:color w:val="000000"/>
+          <w:sz w:val="22"/>
+          <w:szCs w:val="22"/>
         </w:rPr>
         <w:t>.</w:t>
-      </w:r>
-    </w:p>
-    <w:p>
-      <w:pPr>
-        <w:jc w:val="both"/>
-        <w:rPr>
-          <w:rFonts w:eastAsia="Garamond"/>
-          <w:b/>
-          <w:sz w:val="22"/>
-          <w:szCs w:val="22"/>
-        </w:rPr>
-      </w:pPr>
-    </w:p>
-    <w:p>
-      <w:pPr>
-        <w:jc w:val="both"/>
-        <w:rPr>
-          <w:rFonts w:eastAsia="Garamond"/>
-          <w:sz w:val="22"/>
-          <w:szCs w:val="22"/>
-        </w:rPr>
-      </w:pPr>
-      <w:r>
-        <w:rPr>
-          <w:rFonts w:eastAsia="Garamond"/>
-          <w:b/>
-          <w:sz w:val="22"/>
-          <w:szCs w:val="22"/>
-        </w:rPr>
-        <w:t>Undergraduate Student Assistant</w:t>
-      </w:r>
-      <w:r>
-        <w:rPr>
-          <w:rFonts w:eastAsia="Garamond"/>
-          <w:sz w:val="22"/>
-          <w:szCs w:val="22"/>
-        </w:rPr>
-        <w:t>,</w:t>
-      </w:r>
-      <w:r>
-        <w:rPr>
-          <w:rFonts w:eastAsia="Garamond"/>
-          <w:i/>
-          <w:sz w:val="22"/>
-          <w:szCs w:val="22"/>
-        </w:rPr>
-        <w:t xml:space="preserve"> UIC</w:t>
-      </w:r>
-      <w:r>
-        <w:rPr>
-          <w:rFonts w:eastAsia="Garamond"/>
-          <w:iCs/>
-          <w:sz w:val="22"/>
-          <w:szCs w:val="22"/>
-        </w:rPr>
-        <w:t xml:space="preserve">, </w:t>
-      </w:r>
-      <w:r>
-        <w:rPr>
-          <w:rFonts w:eastAsia="Garamond"/>
-          <w:sz w:val="22"/>
-          <w:szCs w:val="22"/>
-        </w:rPr>
-        <w:t xml:space="preserve">Chicago, Illinois                                          </w:t>
-      </w:r>
-      <w:r>
-        <w:rPr>
-          <w:rFonts w:eastAsia="Garamond"/>
-          <w:sz w:val="22"/>
-          <w:szCs w:val="22"/>
-        </w:rPr>
-        <w:t xml:space="preserve">                          </w:t>
-      </w:r>
-      <w:r>
-        <w:rPr>
-          <w:rFonts w:eastAsia="Garamond"/>
-          <w:i/>
-          <w:iCs/>
-          <w:sz w:val="22"/>
-          <w:szCs w:val="22"/>
-        </w:rPr>
-        <w:t>Sep 2018 – April 2019</w:t>
-      </w:r>
-    </w:p>
-    <w:p>
-      <w:pPr>
-        <w:numPr>
-          <w:ilvl w:val="0"/>
-          <w:numId w:val="1"/>
-        </w:numPr>
-        <w:ind w:hanging="261"/>
-        <w:jc w:val="both"/>
-        <w:rPr>
-          <w:rFonts w:eastAsia="Garamond"/>
-          <w:i/>
-          <w:sz w:val="22"/>
-          <w:szCs w:val="22"/>
-        </w:rPr>
-      </w:pPr>
-      <w:r>
-        <w:rPr>
-          <w:sz w:val="22"/>
-          <w:szCs w:val="22"/>
-          <w:shd w:val="clear" w:color="auto" w:fill="FFFFFF"/>
-        </w:rPr>
-        <w:t>Gained valuable hands-on experience by working in the Machine Shop (subtractive manufacturing lab) and Makerspace (additive manufacturing lab).</w:t>
-      </w:r>
-    </w:p>
-    <w:p>
-      <w:pPr>
-        <w:numPr>
-          <w:ilvl w:val="0"/>
-          <w:numId w:val="1"/>
-        </w:numPr>
-        <w:ind w:hanging="261"/>
-        <w:jc w:val="both"/>
-        <w:rPr>
-          <w:rFonts w:eastAsia="Garamond"/>
-          <w:i/>
-          <w:sz w:val="22"/>
-          <w:szCs w:val="22"/>
-        </w:rPr>
-      </w:pPr>
-      <w:r>
-        <w:rPr>
-          <w:sz w:val="22"/>
-          <w:szCs w:val="22"/>
-          <w:shd w:val="clear" w:color="auto" w:fill="FFFFFF"/>
-        </w:rPr>
-        <w:t>Acquired comprehensive expertise in shop and machine safety, adeptly utilizing computer-aided machining software, and operating a range of machinery including manual and CNC mills and routers, laser cutters, lathes, drill presses, belt sanders, and cutoff saws.</w:t>
-      </w:r>
-    </w:p>
-    <w:p>
-      <w:pPr>
-        <w:numPr>
-          <w:ilvl w:val="0"/>
-          <w:numId w:val="1"/>
-        </w:numPr>
-        <w:ind w:hanging="261"/>
-        <w:jc w:val="both"/>
-        <w:rPr>
-          <w:rFonts w:eastAsia="Garamond"/>
-          <w:i/>
-          <w:sz w:val="22"/>
-          <w:szCs w:val="22"/>
-        </w:rPr>
-      </w:pPr>
-      <w:r>
-        <w:rPr>
-          <w:sz w:val="22"/>
-          <w:szCs w:val="22"/>
-          <w:shd w:val="clear" w:color="auto" w:fill="FFFFFF"/>
-        </w:rPr>
-        <w:t>Developed proficiency in the use of polymeric materials by mastering process-specific lab safety, computer-aided design for 3D printing, executing hands-on 3D printing projects, and applying intricate post-processing procedures.</w:t>
-      </w:r>
-    </w:p>
-    <w:p>
-      <w:pPr>
-        <w:jc w:val="both"/>
-        <w:rPr>
-          <w:rFonts w:eastAsia="Garamond"/>
-          <w:i/>
-          <w:sz w:val="22"/>
-          <w:szCs w:val="22"/>
-        </w:rPr>
-      </w:pPr>
-    </w:p>
-    <w:p>
-      <w:pPr>
-        <w:pBdr>
-          <w:top w:val="single" w:sz="4" w:space="1" w:color="auto"/>
-          <w:bottom w:val="single" w:sz="4" w:space="1" w:color="000000"/>
-          <w:between w:val="single" w:sz="4" w:space="1" w:color="auto"/>
-        </w:pBdr>
-        <w:jc w:val="both"/>
-        <w:rPr>
-          <w:rFonts w:eastAsia="Garamond"/>
-          <w:b/>
-          <w:sz w:val="22"/>
-          <w:szCs w:val="22"/>
-        </w:rPr>
-      </w:pPr>
-      <w:r>
-        <w:rPr>
-          <w:rFonts w:eastAsia="Garamond"/>
-          <w:b/>
-          <w:sz w:val="22"/>
-          <w:szCs w:val="22"/>
-        </w:rPr>
-        <w:t>PROJECTS</w:t>
-      </w:r>
-      <w:r>
-        <w:rPr>
-          <w:rFonts w:eastAsia="Garamond"/>
-          <w:sz w:val="22"/>
-          <w:szCs w:val="22"/>
-        </w:rPr>
-        <w:tab/>
-      </w:r>
-      <w:r>
-        <w:rPr>
-          <w:rFonts w:eastAsia="Garamond"/>
-          <w:sz w:val="22"/>
-          <w:szCs w:val="22"/>
-        </w:rPr>
-        <w:tab/>
-      </w:r>
-      <w:r>
-        <w:rPr>
-          <w:rFonts w:eastAsia="Garamond"/>
-          <w:sz w:val="22"/>
-          <w:szCs w:val="22"/>
-        </w:rPr>
-        <w:tab/>
-      </w:r>
-      <w:r>
-        <w:rPr>
-          <w:rFonts w:eastAsia="Garamond"/>
-          <w:sz w:val="22"/>
-          <w:szCs w:val="22"/>
-        </w:rPr>
-        <w:tab/>
-      </w:r>
-      <w:r>
-        <w:rPr>
-          <w:rFonts w:eastAsia="Garamond"/>
-          <w:sz w:val="22"/>
-          <w:szCs w:val="22"/>
-        </w:rPr>
-        <w:tab/>
-      </w:r>
-      <w:r>
-        <w:rPr>
-          <w:rFonts w:eastAsia="Garamond"/>
-          <w:sz w:val="22"/>
-          <w:szCs w:val="22"/>
-        </w:rPr>
-        <w:tab/>
-      </w:r>
-      <w:r>
-        <w:rPr>
-          <w:rFonts w:eastAsia="Garamond"/>
-          <w:sz w:val="22"/>
-          <w:szCs w:val="22"/>
-        </w:rPr>
-        <w:tab/>
-        <w:t xml:space="preserve">      </w:t>
-      </w:r>
-      <w:r>
-        <w:rPr>
-          <w:rFonts w:eastAsia="Garamond"/>
-          <w:i/>
-          <w:sz w:val="22"/>
-          <w:szCs w:val="22"/>
-        </w:rPr>
-        <w:tab/>
-      </w:r>
-      <w:r>
-        <w:rPr>
-          <w:rFonts w:eastAsia="Garamond"/>
-          <w:i/>
-          <w:sz w:val="22"/>
-          <w:szCs w:val="22"/>
-        </w:rPr>
-        <w:tab/>
-      </w:r>
-    </w:p>
-    <w:p>
-      <w:pPr>
-        <w:jc w:val="both"/>
-        <w:rPr>
-          <w:rFonts w:eastAsia="Garamond"/>
-          <w:sz w:val="22"/>
-          <w:szCs w:val="22"/>
-        </w:rPr>
-      </w:pPr>
-      <w:r>
-        <w:rPr>
-          <w:rFonts w:eastAsia="Garamond"/>
-          <w:b/>
-          <w:sz w:val="22"/>
-          <w:szCs w:val="22"/>
-        </w:rPr>
-        <w:t xml:space="preserve">Graduate </w:t>
-      </w:r>
-      <w:r>
-        <w:rPr>
-          <w:rFonts w:eastAsia="Garamond"/>
-          <w:b/>
-          <w:sz w:val="22"/>
-          <w:szCs w:val="22"/>
-        </w:rPr>
-        <w:t>Research Assistant</w:t>
-      </w:r>
-      <w:r>
-        <w:rPr>
-          <w:rFonts w:eastAsia="Garamond"/>
-          <w:iCs/>
-          <w:sz w:val="22"/>
-          <w:szCs w:val="22"/>
-        </w:rPr>
-        <w:t>,</w:t>
-      </w:r>
-      <w:r>
-        <w:rPr>
-          <w:rFonts w:eastAsia="Garamond"/>
-          <w:i/>
-          <w:sz w:val="22"/>
-          <w:szCs w:val="22"/>
-        </w:rPr>
-        <w:t xml:space="preserve"> </w:t>
-      </w:r>
-      <w:r>
-        <w:rPr>
-          <w:rFonts w:eastAsia="Garamond"/>
-          <w:bCs/>
-          <w:i/>
-          <w:iCs/>
-          <w:sz w:val="22"/>
-          <w:szCs w:val="22"/>
-        </w:rPr>
-        <w:t>NASA STTR Phase 1</w:t>
-      </w:r>
-      <w:r>
-        <w:rPr>
-          <w:rFonts w:eastAsia="Garamond"/>
-          <w:sz w:val="22"/>
-          <w:szCs w:val="22"/>
-        </w:rPr>
-        <w:t xml:space="preserve">, Champaign, Illinois                 </w:t>
-      </w:r>
-      <w:r>
-        <w:rPr>
-          <w:rFonts w:eastAsia="Garamond"/>
-          <w:sz w:val="22"/>
-          <w:szCs w:val="22"/>
-        </w:rPr>
-        <w:t xml:space="preserve"> </w:t>
-      </w:r>
-      <w:r>
-        <w:rPr>
-          <w:rFonts w:eastAsia="Garamond"/>
-          <w:sz w:val="22"/>
-          <w:szCs w:val="22"/>
-        </w:rPr>
-        <w:t xml:space="preserve">                  </w:t>
-      </w:r>
-      <w:r>
-        <w:rPr>
-          <w:rFonts w:eastAsia="Garamond"/>
-          <w:sz w:val="22"/>
-          <w:szCs w:val="22"/>
-        </w:rPr>
-        <w:t xml:space="preserve"> </w:t>
-      </w:r>
-      <w:r>
-        <w:rPr>
-          <w:rFonts w:eastAsia="Garamond"/>
-          <w:sz w:val="22"/>
-          <w:szCs w:val="22"/>
-        </w:rPr>
-        <w:t xml:space="preserve">       </w:t>
-      </w:r>
-      <w:r>
-        <w:rPr>
-          <w:rFonts w:eastAsia="Garamond"/>
-          <w:sz w:val="22"/>
-          <w:szCs w:val="22"/>
-        </w:rPr>
-        <w:t xml:space="preserve"> </w:t>
-      </w:r>
-      <w:r>
-        <w:rPr>
-          <w:rFonts w:eastAsia="Garamond"/>
-          <w:i/>
-          <w:iCs/>
-          <w:sz w:val="22"/>
-          <w:szCs w:val="22"/>
-        </w:rPr>
-        <w:t xml:space="preserve">Aug 2022 – </w:t>
-      </w:r>
-      <w:r>
-        <w:rPr>
-          <w:rFonts w:eastAsia="Garamond"/>
-          <w:i/>
-          <w:iCs/>
-          <w:sz w:val="22"/>
-          <w:szCs w:val="22"/>
-        </w:rPr>
-        <w:t>Aug 2023</w:t>
-      </w:r>
-    </w:p>
-    <w:p>
-      <w:pPr>
-        <w:numPr>
-          <w:ilvl w:val="0"/>
-          <w:numId w:val="1"/>
-        </w:numPr>
-        <w:ind w:hanging="261"/>
-        <w:jc w:val="both"/>
-        <w:rPr>
-          <w:rFonts w:eastAsia="Garamond"/>
-          <w:sz w:val="22"/>
-          <w:szCs w:val="22"/>
-        </w:rPr>
-      </w:pPr>
-      <w:r>
-        <w:rPr>
-          <w:rFonts w:eastAsia="Garamond"/>
-          <w:sz w:val="22"/>
-          <w:szCs w:val="22"/>
-        </w:rPr>
-        <w:t>Led key efforts in a collaborative project with a multi-disciplinary team from NASA Jet Propulsion Laboratory, Ten One Aerospace, and UIUC on "</w:t>
-      </w:r>
-      <w:hyperlink r:id="rId19" w:history="1">
-        <w:r>
-          <w:rPr>
-            <w:rStyle w:val="Hyperlink"/>
-            <w:rFonts w:eastAsia="Garamond"/>
-            <w:sz w:val="22"/>
-            <w:szCs w:val="22"/>
-          </w:rPr>
-          <w:t>Assembly of Large Aperture Space Telescopes in Cislunar Space Using a Swarm of Autonomous Small Satellites</w:t>
-        </w:r>
-      </w:hyperlink>
-      <w:r>
-        <w:rPr>
-          <w:rFonts w:eastAsia="Garamond"/>
-          <w:sz w:val="22"/>
-          <w:szCs w:val="22"/>
-        </w:rPr>
-        <w:t>", as part of a NASA STTR project.</w:t>
-      </w:r>
-    </w:p>
-    <w:p>
-      <w:pPr>
-        <w:numPr>
-          <w:ilvl w:val="0"/>
-          <w:numId w:val="1"/>
-        </w:numPr>
-        <w:ind w:hanging="261"/>
-        <w:jc w:val="both"/>
-        <w:rPr>
-          <w:rFonts w:eastAsia="Garamond"/>
-          <w:sz w:val="22"/>
-          <w:szCs w:val="22"/>
-        </w:rPr>
-      </w:pPr>
-      <w:r>
-        <w:rPr>
-          <w:rFonts w:eastAsia="Garamond"/>
-          <w:sz w:val="22"/>
-          <w:szCs w:val="22"/>
-        </w:rPr>
-        <w:t xml:space="preserve">Developed and implemented optimal guidance and control algorithms for satellite swarms, contributing to the successful simulations of </w:t>
-      </w:r>
-      <w:r>
-        <w:rPr>
-          <w:rFonts w:eastAsia="Garamond"/>
-          <w:sz w:val="22"/>
-          <w:szCs w:val="22"/>
-        </w:rPr>
-        <w:t>servicing</w:t>
-      </w:r>
-      <w:r>
-        <w:rPr>
-          <w:rFonts w:eastAsia="Garamond"/>
-          <w:sz w:val="22"/>
-          <w:szCs w:val="22"/>
-        </w:rPr>
-        <w:t xml:space="preserve"> operations in cislunar and deep space.</w:t>
-      </w:r>
-    </w:p>
-    <w:p>
-      <w:pPr>
-        <w:numPr>
-          <w:ilvl w:val="0"/>
-          <w:numId w:val="1"/>
-        </w:numPr>
-        <w:ind w:hanging="261"/>
-        <w:jc w:val="both"/>
-        <w:rPr>
-          <w:rFonts w:eastAsia="Garamond"/>
-          <w:sz w:val="22"/>
-          <w:szCs w:val="22"/>
-        </w:rPr>
-      </w:pPr>
-      <w:r>
-        <w:rPr>
-          <w:rFonts w:eastAsia="Garamond"/>
-          <w:sz w:val="22"/>
-          <w:szCs w:val="22"/>
-        </w:rPr>
-        <w:t>Responsible for comprehensive documentation and communication of project developments, including authoring formal reports for project deliverables and conducting bi-weekly technical presentations to update stakeholders on project progress.</w:t>
-      </w:r>
-    </w:p>
-    <w:p>
-      <w:pPr>
-        <w:jc w:val="both"/>
-        <w:rPr>
-          <w:rFonts w:eastAsia="Garamond"/>
-          <w:b/>
-          <w:sz w:val="22"/>
-          <w:szCs w:val="22"/>
-        </w:rPr>
-      </w:pPr>
-    </w:p>
-    <w:p>
-      <w:pPr>
-        <w:jc w:val="both"/>
-        <w:rPr>
-          <w:rFonts w:eastAsia="Garamond"/>
-          <w:sz w:val="22"/>
-          <w:szCs w:val="22"/>
-        </w:rPr>
-      </w:pPr>
-      <w:r>
-        <w:rPr>
-          <w:rFonts w:eastAsia="Garamond"/>
-          <w:b/>
-          <w:sz w:val="22"/>
-          <w:szCs w:val="22"/>
-        </w:rPr>
-        <w:t>Mechanical Design and Analysis Lead</w:t>
-      </w:r>
-      <w:r>
-        <w:rPr>
-          <w:rFonts w:eastAsia="Garamond"/>
-          <w:bCs/>
-          <w:sz w:val="22"/>
-          <w:szCs w:val="22"/>
-        </w:rPr>
-        <w:t xml:space="preserve">, </w:t>
-      </w:r>
-      <w:r>
-        <w:rPr>
-          <w:rFonts w:eastAsia="Garamond"/>
-          <w:bCs/>
-          <w:i/>
-          <w:iCs/>
-          <w:sz w:val="22"/>
-          <w:szCs w:val="22"/>
-        </w:rPr>
-        <w:t>UIC</w:t>
-      </w:r>
-      <w:r>
-        <w:rPr>
-          <w:rFonts w:eastAsia="Garamond"/>
-          <w:bCs/>
-          <w:sz w:val="22"/>
-          <w:szCs w:val="22"/>
-        </w:rPr>
-        <w:t>,</w:t>
-      </w:r>
-      <w:r>
-        <w:rPr>
-          <w:rFonts w:eastAsia="Garamond"/>
-          <w:b/>
-          <w:sz w:val="22"/>
-          <w:szCs w:val="22"/>
-        </w:rPr>
-        <w:t xml:space="preserve"> </w:t>
-      </w:r>
-      <w:r>
-        <w:rPr>
-          <w:rFonts w:eastAsia="Garamond"/>
-          <w:bCs/>
-          <w:sz w:val="22"/>
-          <w:szCs w:val="22"/>
-        </w:rPr>
-        <w:t>Chicago, Illinois</w:t>
-      </w:r>
-      <w:r>
-        <w:rPr>
-          <w:rFonts w:eastAsia="Garamond"/>
-          <w:bCs/>
-          <w:sz w:val="22"/>
-          <w:szCs w:val="22"/>
-        </w:rPr>
-        <w:t xml:space="preserve">    </w:t>
-      </w:r>
-      <w:r>
-        <w:rPr>
-          <w:rFonts w:eastAsia="Garamond"/>
-          <w:bCs/>
-          <w:sz w:val="22"/>
-          <w:szCs w:val="22"/>
-        </w:rPr>
-        <w:t xml:space="preserve">                               </w:t>
-      </w:r>
-      <w:r>
-        <w:rPr>
-          <w:rFonts w:eastAsia="Garamond"/>
-          <w:bCs/>
-          <w:sz w:val="22"/>
-          <w:szCs w:val="22"/>
-        </w:rPr>
-        <w:t xml:space="preserve">                          </w:t>
-      </w:r>
-      <w:r>
-        <w:rPr>
-          <w:rFonts w:eastAsia="Garamond"/>
-          <w:i/>
-          <w:iCs/>
-          <w:sz w:val="22"/>
-          <w:szCs w:val="22"/>
-        </w:rPr>
-        <w:t>Aug 2020 – May 2021</w:t>
       </w:r>
     </w:p>
     <w:p>
@@ -3665,19 +3898,8 @@
           <w:sz w:val="22"/>
           <w:szCs w:val="22"/>
         </w:rPr>
-        <w:t>Collaborated with senior design team members on the "</w:t>
-      </w:r>
-      <w:hyperlink r:id="rId20" w:history="1">
-        <w:r>
-          <w:rPr>
-            <w:rStyle w:val="Hyperlink"/>
-            <w:rFonts w:eastAsia="Garamond"/>
-            <w:sz w:val="22"/>
-            <w:szCs w:val="22"/>
-          </w:rPr>
-          <w:t>Picture and Video of Earth from the Edge of Space</w:t>
-        </w:r>
-      </w:hyperlink>
+        <w:t>A</w:t>
+      </w:r>
       <w:r>
         <w:rPr>
           <w:rFonts w:eastAsia="Garamond"/>
@@ -3685,7 +3907,25 @@
           <w:sz w:val="22"/>
           <w:szCs w:val="22"/>
         </w:rPr>
-        <w:t>" project, developing a craft capable of carrying a high-altitude balloon to the edge of space, equipped with onboard cameras to capture the entire journey from launch to landing</w:t>
+        <w:t xml:space="preserve">ssembled the craft by integrating multiple subsystems, including custom-made antennas, an electronics payload with video cameras, </w:t>
+      </w:r>
+      <w:r>
+        <w:rPr>
+          <w:rFonts w:eastAsia="Garamond"/>
+          <w:color w:val="000000"/>
+          <w:sz w:val="22"/>
+          <w:szCs w:val="22"/>
+        </w:rPr>
+        <w:t>GPS</w:t>
+      </w:r>
+      <w:r>
+        <w:rPr>
+          <w:rFonts w:eastAsia="Garamond"/>
+          <w:color w:val="000000"/>
+          <w:sz w:val="22"/>
+          <w:szCs w:val="22"/>
+        </w:rPr>
+        <w:t>, and an automatic landing system</w:t>
       </w:r>
       <w:r>
         <w:rPr>
@@ -3725,7 +3965,7 @@
           <w:sz w:val="22"/>
           <w:szCs w:val="22"/>
         </w:rPr>
-        <w:t>A</w:t>
+        <w:t>Designed and tested</w:t>
       </w:r>
       <w:r>
         <w:rPr>
@@ -3734,7 +3974,7 @@
           <w:sz w:val="22"/>
           <w:szCs w:val="22"/>
         </w:rPr>
-        <w:t xml:space="preserve">ssembled the craft by integrating multiple subsystems, including custom-made antennas, an electronics payload with video cameras, </w:t>
+        <w:t xml:space="preserve"> a safe and reliable low-power release mechanism using a one-dimensional servo motor, designed to detach the payload from the balloon and enable its glide back to Earth for recovery</w:t>
       </w:r>
       <w:r>
         <w:rPr>
@@ -3743,25 +3983,119 @@
           <w:sz w:val="22"/>
           <w:szCs w:val="22"/>
         </w:rPr>
-        <w:t>GPS</w:t>
-      </w:r>
-      <w:r>
+        <w:t>.</w:t>
+      </w:r>
+    </w:p>
+    <w:p>
+      <w:pPr>
+        <w:pBdr>
+          <w:top w:val="nil"/>
+          <w:left w:val="nil"/>
+          <w:bottom w:val="nil"/>
+          <w:right w:val="nil"/>
+          <w:between w:val="nil"/>
+        </w:pBdr>
+        <w:jc w:val="both"/>
         <w:rPr>
           <w:rFonts w:eastAsia="Garamond"/>
           <w:color w:val="000000"/>
           <w:sz w:val="22"/>
           <w:szCs w:val="22"/>
         </w:rPr>
-        <w:t>, and an automatic landing system</w:t>
-      </w:r>
-      <w:r>
-        <w:rPr>
-          <w:rFonts w:eastAsia="Garamond"/>
-          <w:color w:val="000000"/>
-          <w:sz w:val="22"/>
-          <w:szCs w:val="22"/>
-        </w:rPr>
-        <w:t>.</w:t>
+      </w:pPr>
+    </w:p>
+    <w:p>
+      <w:pPr>
+        <w:jc w:val="both"/>
+        <w:rPr>
+          <w:rFonts w:eastAsia="Garamond"/>
+          <w:sz w:val="22"/>
+          <w:szCs w:val="22"/>
+        </w:rPr>
+      </w:pPr>
+      <w:r>
+        <w:rPr>
+          <w:rFonts w:eastAsia="Garamond"/>
+          <w:b/>
+          <w:sz w:val="22"/>
+          <w:szCs w:val="22"/>
+        </w:rPr>
+        <w:t>Sub-Lead: Structures</w:t>
+      </w:r>
+      <w:r>
+        <w:rPr>
+          <w:rFonts w:eastAsia="Garamond"/>
+          <w:bCs/>
+          <w:sz w:val="22"/>
+          <w:szCs w:val="22"/>
+        </w:rPr>
+        <w:t>,</w:t>
+      </w:r>
+      <w:r>
+        <w:rPr>
+          <w:rFonts w:eastAsia="Garamond"/>
+          <w:bCs/>
+          <w:i/>
+          <w:iCs/>
+          <w:sz w:val="22"/>
+          <w:szCs w:val="22"/>
+        </w:rPr>
+        <w:t xml:space="preserve"> AIAA UIC Chapter</w:t>
+      </w:r>
+      <w:r>
+        <w:rPr>
+          <w:rFonts w:eastAsia="Garamond"/>
+          <w:bCs/>
+          <w:sz w:val="22"/>
+          <w:szCs w:val="22"/>
+        </w:rPr>
+        <w:t>,</w:t>
+      </w:r>
+      <w:r>
+        <w:rPr>
+          <w:rFonts w:eastAsia="Garamond"/>
+          <w:b/>
+          <w:sz w:val="22"/>
+          <w:szCs w:val="22"/>
+        </w:rPr>
+        <w:t xml:space="preserve"> </w:t>
+      </w:r>
+      <w:r>
+        <w:rPr>
+          <w:rFonts w:eastAsia="Garamond"/>
+          <w:bCs/>
+          <w:sz w:val="22"/>
+          <w:szCs w:val="22"/>
+        </w:rPr>
+        <w:t xml:space="preserve">Chicago, Illinois                                        </w:t>
+      </w:r>
+      <w:r>
+        <w:rPr>
+          <w:rFonts w:eastAsia="Garamond"/>
+          <w:bCs/>
+          <w:sz w:val="22"/>
+          <w:szCs w:val="22"/>
+        </w:rPr>
+        <w:t xml:space="preserve"> </w:t>
+      </w:r>
+      <w:r>
+        <w:rPr>
+          <w:rFonts w:eastAsia="Garamond"/>
+          <w:bCs/>
+          <w:sz w:val="22"/>
+          <w:szCs w:val="22"/>
+        </w:rPr>
+        <w:t xml:space="preserve">                          </w:t>
+      </w:r>
+      <w:r>
+        <w:rPr>
+          <w:rFonts w:eastAsia="Garamond"/>
+          <w:i/>
+          <w:iCs/>
+          <w:sz w:val="22"/>
+          <w:szCs w:val="22"/>
+        </w:rPr>
+        <w:t>Sep 2017 – Jan 2020</w:t>
       </w:r>
     </w:p>
     <w:p>
@@ -3792,7 +4126,7 @@
           <w:sz w:val="22"/>
           <w:szCs w:val="22"/>
         </w:rPr>
-        <w:t>Designed and tested</w:t>
+        <w:t>Worked with the structures team to analyze the structural dynamics of rockets under diverse loads, leading efforts in fabricating and integrating key components such as nosecone, body, and motor</w:t>
       </w:r>
       <w:r>
         <w:rPr>
@@ -3801,128 +4135,7 @@
           <w:sz w:val="22"/>
           <w:szCs w:val="22"/>
         </w:rPr>
-        <w:t xml:space="preserve"> a safe and reliable low-power release mechanism using a one-dimensional servo motor, designed to detach the payload from the balloon and enable its glide back to Earth for recovery</w:t>
-      </w:r>
-      <w:r>
-        <w:rPr>
-          <w:rFonts w:eastAsia="Garamond"/>
-          <w:color w:val="000000"/>
-          <w:sz w:val="22"/>
-          <w:szCs w:val="22"/>
-        </w:rPr>
         <w:t>.</w:t>
-      </w:r>
-    </w:p>
-    <w:p>
-      <w:pPr>
-        <w:pBdr>
-          <w:top w:val="nil"/>
-          <w:left w:val="nil"/>
-          <w:bottom w:val="nil"/>
-          <w:right w:val="nil"/>
-          <w:between w:val="nil"/>
-        </w:pBdr>
-        <w:jc w:val="both"/>
-        <w:rPr>
-          <w:rFonts w:eastAsia="Garamond"/>
-          <w:color w:val="000000"/>
-          <w:sz w:val="22"/>
-          <w:szCs w:val="22"/>
-        </w:rPr>
-      </w:pPr>
-    </w:p>
-    <w:p>
-      <w:pPr>
-        <w:jc w:val="both"/>
-        <w:rPr>
-          <w:rFonts w:eastAsia="Garamond"/>
-          <w:sz w:val="22"/>
-          <w:szCs w:val="22"/>
-        </w:rPr>
-      </w:pPr>
-      <w:r>
-        <w:rPr>
-          <w:rFonts w:eastAsia="Garamond"/>
-          <w:b/>
-          <w:sz w:val="22"/>
-          <w:szCs w:val="22"/>
-        </w:rPr>
-        <w:t>Sub-Lead: Structures</w:t>
-      </w:r>
-      <w:r>
-        <w:rPr>
-          <w:rFonts w:eastAsia="Garamond"/>
-          <w:bCs/>
-          <w:sz w:val="22"/>
-          <w:szCs w:val="22"/>
-        </w:rPr>
-        <w:t>,</w:t>
-      </w:r>
-      <w:r>
-        <w:rPr>
-          <w:rFonts w:eastAsia="Garamond"/>
-          <w:bCs/>
-          <w:i/>
-          <w:iCs/>
-          <w:sz w:val="22"/>
-          <w:szCs w:val="22"/>
-        </w:rPr>
-        <w:t xml:space="preserve"> AIAA UIC Chapter</w:t>
-      </w:r>
-      <w:r>
-        <w:rPr>
-          <w:rFonts w:eastAsia="Garamond"/>
-          <w:bCs/>
-          <w:sz w:val="22"/>
-          <w:szCs w:val="22"/>
-        </w:rPr>
-        <w:t>,</w:t>
-      </w:r>
-      <w:r>
-        <w:rPr>
-          <w:rFonts w:eastAsia="Garamond"/>
-          <w:b/>
-          <w:sz w:val="22"/>
-          <w:szCs w:val="22"/>
-        </w:rPr>
-        <w:t xml:space="preserve"> </w:t>
-      </w:r>
-      <w:r>
-        <w:rPr>
-          <w:rFonts w:eastAsia="Garamond"/>
-          <w:bCs/>
-          <w:sz w:val="22"/>
-          <w:szCs w:val="22"/>
-        </w:rPr>
-        <w:t xml:space="preserve">Chicago, Illinois                                        </w:t>
-      </w:r>
-      <w:r>
-        <w:rPr>
-          <w:rFonts w:eastAsia="Garamond"/>
-          <w:bCs/>
-          <w:sz w:val="22"/>
-          <w:szCs w:val="22"/>
-        </w:rPr>
-        <w:t xml:space="preserve"> </w:t>
-      </w:r>
-      <w:r>
-        <w:rPr>
-          <w:rFonts w:eastAsia="Garamond"/>
-          <w:bCs/>
-          <w:sz w:val="22"/>
-          <w:szCs w:val="22"/>
-        </w:rPr>
-        <w:t xml:space="preserve">                          </w:t>
-      </w:r>
-      <w:r>
-        <w:rPr>
-          <w:rFonts w:eastAsia="Garamond"/>
-          <w:i/>
-          <w:iCs/>
-          <w:sz w:val="22"/>
-          <w:szCs w:val="22"/>
-        </w:rPr>
-        <w:t>Sep 2017 – Jan 2020</w:t>
       </w:r>
     </w:p>
     <w:p>
@@ -3953,16 +4166,7 @@
           <w:sz w:val="22"/>
           <w:szCs w:val="22"/>
         </w:rPr>
-        <w:t>Worked with the structures team to analyze the structural dynamics of rockets under diverse loads, leading efforts in fabricating and integrating key components such as nosecone, body, and motor</w:t>
-      </w:r>
-      <w:r>
-        <w:rPr>
-          <w:rFonts w:eastAsia="Garamond"/>
-          <w:color w:val="000000"/>
-          <w:sz w:val="22"/>
-          <w:szCs w:val="22"/>
-        </w:rPr>
-        <w:t>.</w:t>
+        <w:t>Achieved first place in Student Research and Development (SRAD) 30,000 ft and second place in Commercial-Off-The-Shelf categories at the 2018 Intercollegiate Rocket Engineering Competition, contributing significantly to a team competing in high-powered rocket contests nationwide.</w:t>
       </w:r>
     </w:p>
     <w:p>
@@ -3993,37 +4197,6 @@
           <w:sz w:val="22"/>
           <w:szCs w:val="22"/>
         </w:rPr>
-        <w:t>Achieved first place in Student Research and Development (SRAD) 30,000 ft and second place in Commercial-Off-The-Shelf categories at the 2018 Intercollegiate Rocket Engineering Competition, contributing significantly to a team competing in high-powered rocket contests nationwide.</w:t>
-      </w:r>
-    </w:p>
-    <w:p>
-      <w:pPr>
-        <w:numPr>
-          <w:ilvl w:val="0"/>
-          <w:numId w:val="13"/>
-        </w:numPr>
-        <w:pBdr>
-          <w:top w:val="nil"/>
-          <w:left w:val="nil"/>
-          <w:bottom w:val="nil"/>
-          <w:right w:val="nil"/>
-          <w:between w:val="nil"/>
-        </w:pBdr>
-        <w:jc w:val="both"/>
-        <w:rPr>
-          <w:rFonts w:eastAsia="Garamond"/>
-          <w:color w:val="000000"/>
-          <w:sz w:val="22"/>
-          <w:szCs w:val="22"/>
-        </w:rPr>
-      </w:pPr>
-      <w:r>
-        <w:rPr>
-          <w:rFonts w:eastAsia="Garamond"/>
-          <w:color w:val="000000"/>
-          <w:sz w:val="22"/>
-          <w:szCs w:val="22"/>
-        </w:rPr>
         <w:t>Contributed to continuous improvement in rocket design and performance, using simulations and physical testing to optimize stability, durability, and efficiency under challenging flight conditions.</w:t>
       </w:r>
     </w:p>
@@ -4242,7 +4415,7 @@
           <w:szCs w:val="22"/>
         </w:rPr>
       </w:pPr>
-      <w:hyperlink r:id="rId21" w:history="1">
+      <w:hyperlink r:id="rId23" w:history="1">
         <w:r>
           <w:rPr>
             <w:rStyle w:val="Hyperlink"/>
@@ -5196,17 +5369,15 @@
           <w:sz w:val="22"/>
           <w:szCs w:val="22"/>
         </w:rPr>
-        <w:t xml:space="preserve">, </w:t>
-      </w:r>
-      <w:r>
-        <w:rPr>
-          <w:rFonts w:eastAsia="Garamond"/>
-          <w:i/>
-          <w:iCs/>
-          <w:sz w:val="22"/>
-          <w:szCs w:val="22"/>
-        </w:rPr>
-        <w:t xml:space="preserve">AIAA  </w:t>
+        <w:t>,</w:t>
+      </w:r>
+      <w:r>
+        <w:rPr>
+          <w:rFonts w:eastAsia="Garamond"/>
+          <w:sz w:val="22"/>
+          <w:szCs w:val="22"/>
+        </w:rPr>
+        <w:t xml:space="preserve"> </w:t>
       </w:r>
       <w:r>
         <w:rPr>
@@ -5224,7 +5395,27 @@
           <w:sz w:val="22"/>
           <w:szCs w:val="22"/>
         </w:rPr>
-        <w:t xml:space="preserve">                                      Nov</w:t>
+        <w:t xml:space="preserve">                                     </w:t>
+      </w:r>
+      <w:r>
+        <w:rPr>
+          <w:rFonts w:eastAsia="Garamond"/>
+          <w:i/>
+          <w:iCs/>
+          <w:sz w:val="22"/>
+          <w:szCs w:val="22"/>
+        </w:rPr>
+        <w:t xml:space="preserve">          </w:t>
+      </w:r>
+      <w:r>
+        <w:rPr>
+          <w:rFonts w:eastAsia="Garamond"/>
+          <w:i/>
+          <w:iCs/>
+          <w:sz w:val="22"/>
+          <w:szCs w:val="22"/>
+        </w:rPr>
+        <w:t xml:space="preserve"> Nov</w:t>
       </w:r>
       <w:r>
         <w:rPr>
@@ -5411,6 +5602,99 @@
           <w:szCs w:val="22"/>
         </w:rPr>
         <w:t>April</w:t>
+      </w:r>
+      <w:r>
+        <w:rPr>
+          <w:rFonts w:eastAsia="Garamond"/>
+          <w:i/>
+          <w:iCs/>
+          <w:sz w:val="22"/>
+          <w:szCs w:val="22"/>
+        </w:rPr>
+        <w:t xml:space="preserve"> 202</w:t>
+      </w:r>
+      <w:r>
+        <w:rPr>
+          <w:rFonts w:eastAsia="Garamond"/>
+          <w:i/>
+          <w:iCs/>
+          <w:sz w:val="22"/>
+          <w:szCs w:val="22"/>
+        </w:rPr>
+        <w:t>6</w:t>
+      </w:r>
+      <w:r>
+        <w:rPr>
+          <w:rFonts w:eastAsia="Garamond"/>
+          <w:i/>
+          <w:iCs/>
+          <w:sz w:val="22"/>
+          <w:szCs w:val="22"/>
+        </w:rPr>
+        <w:t xml:space="preserve"> – Present</w:t>
+      </w:r>
+    </w:p>
+    <w:p>
+      <w:pPr>
+        <w:pStyle w:val="ListParagraph"/>
+        <w:numPr>
+          <w:ilvl w:val="0"/>
+          <w:numId w:val="13"/>
+        </w:numPr>
+        <w:spacing w:line="276" w:lineRule="auto"/>
+        <w:rPr>
+          <w:rFonts w:eastAsia="Garamond"/>
+          <w:sz w:val="22"/>
+          <w:szCs w:val="22"/>
+        </w:rPr>
+      </w:pPr>
+      <w:r>
+        <w:rPr>
+          <w:rFonts w:eastAsia="Garamond"/>
+          <w:b/>
+          <w:bCs/>
+          <w:sz w:val="22"/>
+          <w:szCs w:val="22"/>
+        </w:rPr>
+        <w:t>Peer Reviewer</w:t>
+      </w:r>
+      <w:r>
+        <w:rPr>
+          <w:rFonts w:eastAsia="Garamond"/>
+          <w:sz w:val="22"/>
+          <w:szCs w:val="22"/>
+        </w:rPr>
+        <w:t xml:space="preserve">, </w:t>
+      </w:r>
+      <w:r>
+        <w:rPr>
+          <w:rFonts w:eastAsia="Garamond"/>
+          <w:i/>
+          <w:iCs/>
+          <w:sz w:val="22"/>
+          <w:szCs w:val="22"/>
+        </w:rPr>
+        <w:t>CEAS Space Journal</w:t>
+      </w:r>
+      <w:r>
+        <w:rPr>
+          <w:rFonts w:eastAsia="Garamond"/>
+          <w:i/>
+          <w:iCs/>
+          <w:sz w:val="22"/>
+          <w:szCs w:val="22"/>
+        </w:rPr>
+        <w:t xml:space="preserve">                                                 </w:t>
+      </w:r>
+      <w:r>
+        <w:rPr>
+          <w:rFonts w:eastAsia="Garamond"/>
+          <w:i/>
+          <w:iCs/>
+          <w:sz w:val="22"/>
+          <w:szCs w:val="22"/>
+        </w:rPr>
+        <w:t xml:space="preserve">                                            May</w:t>
       </w:r>
       <w:r>
         <w:rPr>

</xml_diff>